<commit_message>
feat: add guarded cross-route comparison
</commit_message>
<xml_diff>
--- a/docs/testing/final-results/06-cross-route-comparison/workbook/generated/cross-route-comparison-final-report.docx
+++ b/docs/testing/final-results/06-cross-route-comparison/workbook/generated/cross-route-comparison-final-report.docx
@@ -1972,7 +1972,7 @@
         <w:spacing w:before="160" w:after="100"/>
       </w:pPr>
       <w:r>
-        <w:t>CP-01 — Machine-readable comparability matrix</w:t>
+        <w:t>CP-01 — Comparability decision matrix</w:t>
       </w:r>
     </w:p>
     <w:tbl>
@@ -1983,11 +1983,14 @@
         <w:tblLook w:firstColumn="1" w:firstRow="1" w:lastColumn="0" w:lastRow="0" w:noHBand="0" w:noVBand="1" w:val="04A0"/>
       </w:tblPr>
       <w:tblGrid>
-        <w:gridCol w:w="2992"/>
-        <w:gridCol w:w="2992"/>
-        <w:gridCol w:w="2992"/>
-        <w:gridCol w:w="2992"/>
-        <w:gridCol w:w="2992"/>
+        <w:gridCol w:w="1870"/>
+        <w:gridCol w:w="1870"/>
+        <w:gridCol w:w="1870"/>
+        <w:gridCol w:w="1870"/>
+        <w:gridCol w:w="1870"/>
+        <w:gridCol w:w="1870"/>
+        <w:gridCol w:w="1870"/>
+        <w:gridCol w:w="1870"/>
       </w:tblGrid>
       <w:tr>
         <w:trPr>
@@ -1996,7 +1999,7 @@
         </w:trPr>
         <w:tc>
           <w:tcPr>
-            <w:tcW w:type="dxa" w:w="2992"/>
+            <w:tcW w:type="dxa" w:w="1870"/>
             <w:vAlign w:val="center"/>
             <w:shd w:fill="0B63CE"/>
           </w:tcPr>
@@ -2017,7 +2020,7 @@
         </w:tc>
         <w:tc>
           <w:tcPr>
-            <w:tcW w:type="dxa" w:w="2992"/>
+            <w:tcW w:type="dxa" w:w="1870"/>
             <w:vAlign w:val="center"/>
             <w:shd w:fill="0B63CE"/>
           </w:tcPr>
@@ -2038,7 +2041,7 @@
         </w:tc>
         <w:tc>
           <w:tcPr>
-            <w:tcW w:type="dxa" w:w="2992"/>
+            <w:tcW w:type="dxa" w:w="1870"/>
             <w:vAlign w:val="center"/>
             <w:shd w:fill="0B63CE"/>
           </w:tcPr>
@@ -2059,7 +2062,7 @@
         </w:tc>
         <w:tc>
           <w:tcPr>
-            <w:tcW w:type="dxa" w:w="2992"/>
+            <w:tcW w:type="dxa" w:w="1870"/>
             <w:vAlign w:val="center"/>
             <w:shd w:fill="0B63CE"/>
           </w:tcPr>
@@ -2080,7 +2083,7 @@
         </w:tc>
         <w:tc>
           <w:tcPr>
-            <w:tcW w:type="dxa" w:w="2992"/>
+            <w:tcW w:type="dxa" w:w="1870"/>
             <w:vAlign w:val="center"/>
             <w:shd w:fill="0B63CE"/>
           </w:tcPr>
@@ -2095,7 +2098,70 @@
                 <w:color w:val="FFFFFF"/>
                 <w:sz w:val="16"/>
               </w:rPr>
-              <w:t>Reason codes</w:t>
+              <w:t>Matched</w:t>
+            </w:r>
+          </w:p>
+        </w:tc>
+        <w:tc>
+          <w:tcPr>
+            <w:tcW w:type="dxa" w:w="1870"/>
+            <w:vAlign w:val="center"/>
+            <w:shd w:fill="0B63CE"/>
+          </w:tcPr>
+          <w:p>
+            <w:pPr>
+              <w:spacing w:after="0"/>
+            </w:pPr>
+            <w:r>
+              <w:rPr>
+                <w:rFonts w:ascii="Aptos" w:hAnsi="Aptos"/>
+                <w:b/>
+                <w:color w:val="FFFFFF"/>
+                <w:sz w:val="16"/>
+              </w:rPr>
+              <w:t>Left only</w:t>
+            </w:r>
+          </w:p>
+        </w:tc>
+        <w:tc>
+          <w:tcPr>
+            <w:tcW w:type="dxa" w:w="1870"/>
+            <w:vAlign w:val="center"/>
+            <w:shd w:fill="0B63CE"/>
+          </w:tcPr>
+          <w:p>
+            <w:pPr>
+              <w:spacing w:after="0"/>
+            </w:pPr>
+            <w:r>
+              <w:rPr>
+                <w:rFonts w:ascii="Aptos" w:hAnsi="Aptos"/>
+                <w:b/>
+                <w:color w:val="FFFFFF"/>
+                <w:sz w:val="16"/>
+              </w:rPr>
+              <w:t>Right only</w:t>
+            </w:r>
+          </w:p>
+        </w:tc>
+        <w:tc>
+          <w:tcPr>
+            <w:tcW w:type="dxa" w:w="1870"/>
+            <w:vAlign w:val="center"/>
+            <w:shd w:fill="0B63CE"/>
+          </w:tcPr>
+          <w:p>
+            <w:pPr>
+              <w:spacing w:after="0"/>
+            </w:pPr>
+            <w:r>
+              <w:rPr>
+                <w:rFonts w:ascii="Aptos" w:hAnsi="Aptos"/>
+                <w:b/>
+                <w:color w:val="FFFFFF"/>
+                <w:sz w:val="16"/>
+              </w:rPr>
+              <w:t>Reason summary</w:t>
             </w:r>
           </w:p>
         </w:tc>
@@ -2106,7 +2172,7 @@
         </w:trPr>
         <w:tc>
           <w:tcPr>
-            <w:tcW w:type="dxa" w:w="2992"/>
+            <w:tcW w:type="dxa" w:w="1870"/>
             <w:vAlign w:val="center"/>
           </w:tcPr>
           <w:p>
@@ -2124,7 +2190,7 @@
         </w:tc>
         <w:tc>
           <w:tcPr>
-            <w:tcW w:type="dxa" w:w="2992"/>
+            <w:tcW w:type="dxa" w:w="1870"/>
             <w:vAlign w:val="center"/>
           </w:tcPr>
           <w:p>
@@ -2142,7 +2208,7 @@
         </w:tc>
         <w:tc>
           <w:tcPr>
-            <w:tcW w:type="dxa" w:w="2992"/>
+            <w:tcW w:type="dxa" w:w="1870"/>
             <w:vAlign w:val="center"/>
           </w:tcPr>
           <w:p>
@@ -2160,7 +2226,7 @@
         </w:tc>
         <w:tc>
           <w:tcPr>
-            <w:tcW w:type="dxa" w:w="2992"/>
+            <w:tcW w:type="dxa" w:w="1870"/>
             <w:vAlign w:val="center"/>
           </w:tcPr>
           <w:p>
@@ -2178,19 +2244,73 @@
         </w:tc>
         <w:tc>
           <w:tcPr>
-            <w:tcW w:type="dxa" w:w="2992"/>
-            <w:vAlign w:val="center"/>
-          </w:tcPr>
-          <w:p>
-            <w:pPr>
-              <w:spacing w:after="0"/>
-            </w:pPr>
-            <w:r>
-              <w:rPr>
-                <w:rFonts w:ascii="Aptos" w:hAnsi="Aptos"/>
-                <w:sz w:val="16"/>
-              </w:rPr>
-              <w:t>["model_mismatch","input_length_mismatch","output_length_mismatch","repetition_treatment_mismatch","input_length_missing","output_length_missing"]</w:t>
+            <w:tcW w:type="dxa" w:w="1870"/>
+            <w:vAlign w:val="center"/>
+          </w:tcPr>
+          <w:p>
+            <w:pPr>
+              <w:spacing w:after="0"/>
+            </w:pPr>
+            <w:r>
+              <w:rPr>
+                <w:rFonts w:ascii="Aptos" w:hAnsi="Aptos"/>
+                <w:sz w:val="16"/>
+              </w:rPr>
+              <w:t>0</w:t>
+            </w:r>
+          </w:p>
+        </w:tc>
+        <w:tc>
+          <w:tcPr>
+            <w:tcW w:type="dxa" w:w="1870"/>
+            <w:vAlign w:val="center"/>
+          </w:tcPr>
+          <w:p>
+            <w:pPr>
+              <w:spacing w:after="0"/>
+            </w:pPr>
+            <w:r>
+              <w:rPr>
+                <w:rFonts w:ascii="Aptos" w:hAnsi="Aptos"/>
+                <w:sz w:val="16"/>
+              </w:rPr>
+              <w:t>7</w:t>
+            </w:r>
+          </w:p>
+        </w:tc>
+        <w:tc>
+          <w:tcPr>
+            <w:tcW w:type="dxa" w:w="1870"/>
+            <w:vAlign w:val="center"/>
+          </w:tcPr>
+          <w:p>
+            <w:pPr>
+              <w:spacing w:after="0"/>
+            </w:pPr>
+            <w:r>
+              <w:rPr>
+                <w:rFonts w:ascii="Aptos" w:hAnsi="Aptos"/>
+                <w:sz w:val="16"/>
+              </w:rPr>
+              <w:t>19</w:t>
+            </w:r>
+          </w:p>
+        </w:tc>
+        <w:tc>
+          <w:tcPr>
+            <w:tcW w:type="dxa" w:w="1870"/>
+            <w:vAlign w:val="center"/>
+          </w:tcPr>
+          <w:p>
+            <w:pPr>
+              <w:spacing w:after="0"/>
+            </w:pPr>
+            <w:r>
+              <w:rPr>
+                <w:rFonts w:ascii="Aptos" w:hAnsi="Aptos"/>
+                <w:sz w:val="16"/>
+              </w:rPr>
+              <w:t>no_matched_case_ids</w:t>
             </w:r>
           </w:p>
         </w:tc>
@@ -2201,7 +2321,7 @@
         </w:trPr>
         <w:tc>
           <w:tcPr>
-            <w:tcW w:type="dxa" w:w="2992"/>
+            <w:tcW w:type="dxa" w:w="1870"/>
             <w:vAlign w:val="center"/>
             <w:shd w:fill="EEF4F8"/>
           </w:tcPr>
@@ -2220,7 +2340,7 @@
         </w:tc>
         <w:tc>
           <w:tcPr>
-            <w:tcW w:type="dxa" w:w="2992"/>
+            <w:tcW w:type="dxa" w:w="1870"/>
             <w:vAlign w:val="center"/>
             <w:shd w:fill="EEF4F8"/>
           </w:tcPr>
@@ -2239,7 +2359,7 @@
         </w:tc>
         <w:tc>
           <w:tcPr>
-            <w:tcW w:type="dxa" w:w="2992"/>
+            <w:tcW w:type="dxa" w:w="1870"/>
             <w:vAlign w:val="center"/>
             <w:shd w:fill="EEF4F8"/>
           </w:tcPr>
@@ -2258,7 +2378,7 @@
         </w:tc>
         <w:tc>
           <w:tcPr>
-            <w:tcW w:type="dxa" w:w="2992"/>
+            <w:tcW w:type="dxa" w:w="1870"/>
             <w:vAlign w:val="center"/>
             <w:shd w:fill="EEF4F8"/>
           </w:tcPr>
@@ -2277,20 +2397,77 @@
         </w:tc>
         <w:tc>
           <w:tcPr>
-            <w:tcW w:type="dxa" w:w="2992"/>
-            <w:vAlign w:val="center"/>
-            <w:shd w:fill="EEF4F8"/>
-          </w:tcPr>
-          <w:p>
-            <w:pPr>
-              <w:spacing w:after="0"/>
-            </w:pPr>
-            <w:r>
-              <w:rPr>
-                <w:rFonts w:ascii="Aptos" w:hAnsi="Aptos"/>
-                <w:sz w:val="16"/>
-              </w:rPr>
-              <w:t>["model_mismatch","scoring_version_mismatch"]</w:t>
+            <w:tcW w:type="dxa" w:w="1870"/>
+            <w:vAlign w:val="center"/>
+            <w:shd w:fill="EEF4F8"/>
+          </w:tcPr>
+          <w:p>
+            <w:pPr>
+              <w:spacing w:after="0"/>
+            </w:pPr>
+            <w:r>
+              <w:rPr>
+                <w:rFonts w:ascii="Aptos" w:hAnsi="Aptos"/>
+                <w:sz w:val="16"/>
+              </w:rPr>
+              <w:t>0</w:t>
+            </w:r>
+          </w:p>
+        </w:tc>
+        <w:tc>
+          <w:tcPr>
+            <w:tcW w:type="dxa" w:w="1870"/>
+            <w:vAlign w:val="center"/>
+            <w:shd w:fill="EEF4F8"/>
+          </w:tcPr>
+          <w:p>
+            <w:pPr>
+              <w:spacing w:after="0"/>
+            </w:pPr>
+            <w:r>
+              <w:rPr>
+                <w:rFonts w:ascii="Aptos" w:hAnsi="Aptos"/>
+                <w:sz w:val="16"/>
+              </w:rPr>
+              <w:t>7</w:t>
+            </w:r>
+          </w:p>
+        </w:tc>
+        <w:tc>
+          <w:tcPr>
+            <w:tcW w:type="dxa" w:w="1870"/>
+            <w:vAlign w:val="center"/>
+            <w:shd w:fill="EEF4F8"/>
+          </w:tcPr>
+          <w:p>
+            <w:pPr>
+              <w:spacing w:after="0"/>
+            </w:pPr>
+            <w:r>
+              <w:rPr>
+                <w:rFonts w:ascii="Aptos" w:hAnsi="Aptos"/>
+                <w:sz w:val="16"/>
+              </w:rPr>
+              <w:t>19</w:t>
+            </w:r>
+          </w:p>
+        </w:tc>
+        <w:tc>
+          <w:tcPr>
+            <w:tcW w:type="dxa" w:w="1870"/>
+            <w:vAlign w:val="center"/>
+            <w:shd w:fill="EEF4F8"/>
+          </w:tcPr>
+          <w:p>
+            <w:pPr>
+              <w:spacing w:after="0"/>
+            </w:pPr>
+            <w:r>
+              <w:rPr>
+                <w:rFonts w:ascii="Aptos" w:hAnsi="Aptos"/>
+                <w:sz w:val="16"/>
+              </w:rPr>
+              <w:t>no_matched_case_ids; +3 more (see catalog CSV)</w:t>
             </w:r>
           </w:p>
         </w:tc>
@@ -2301,7 +2478,7 @@
         </w:trPr>
         <w:tc>
           <w:tcPr>
-            <w:tcW w:type="dxa" w:w="2992"/>
+            <w:tcW w:type="dxa" w:w="1870"/>
             <w:vAlign w:val="center"/>
           </w:tcPr>
           <w:p>
@@ -2319,7 +2496,7 @@
         </w:tc>
         <w:tc>
           <w:tcPr>
-            <w:tcW w:type="dxa" w:w="2992"/>
+            <w:tcW w:type="dxa" w:w="1870"/>
             <w:vAlign w:val="center"/>
           </w:tcPr>
           <w:p>
@@ -2337,7 +2514,7 @@
         </w:tc>
         <w:tc>
           <w:tcPr>
-            <w:tcW w:type="dxa" w:w="2992"/>
+            <w:tcW w:type="dxa" w:w="1870"/>
             <w:vAlign w:val="center"/>
           </w:tcPr>
           <w:p>
@@ -2355,7 +2532,7 @@
         </w:tc>
         <w:tc>
           <w:tcPr>
-            <w:tcW w:type="dxa" w:w="2992"/>
+            <w:tcW w:type="dxa" w:w="1870"/>
             <w:vAlign w:val="center"/>
           </w:tcPr>
           <w:p>
@@ -2373,19 +2550,73 @@
         </w:tc>
         <w:tc>
           <w:tcPr>
-            <w:tcW w:type="dxa" w:w="2992"/>
-            <w:vAlign w:val="center"/>
-          </w:tcPr>
-          <w:p>
-            <w:pPr>
-              <w:spacing w:after="0"/>
-            </w:pPr>
-            <w:r>
-              <w:rPr>
-                <w:rFonts w:ascii="Aptos" w:hAnsi="Aptos"/>
-                <w:sz w:val="16"/>
-              </w:rPr>
-              <w:t>["model_mismatch","input_length_mismatch","output_length_mismatch","backend_class_mismatch","repetition_treatment_mismatch"]</w:t>
+            <w:tcW w:type="dxa" w:w="1870"/>
+            <w:vAlign w:val="center"/>
+          </w:tcPr>
+          <w:p>
+            <w:pPr>
+              <w:spacing w:after="0"/>
+            </w:pPr>
+            <w:r>
+              <w:rPr>
+                <w:rFonts w:ascii="Aptos" w:hAnsi="Aptos"/>
+                <w:sz w:val="16"/>
+              </w:rPr>
+              <w:t>0</w:t>
+            </w:r>
+          </w:p>
+        </w:tc>
+        <w:tc>
+          <w:tcPr>
+            <w:tcW w:type="dxa" w:w="1870"/>
+            <w:vAlign w:val="center"/>
+          </w:tcPr>
+          <w:p>
+            <w:pPr>
+              <w:spacing w:after="0"/>
+            </w:pPr>
+            <w:r>
+              <w:rPr>
+                <w:rFonts w:ascii="Aptos" w:hAnsi="Aptos"/>
+                <w:sz w:val="16"/>
+              </w:rPr>
+              <w:t>7</w:t>
+            </w:r>
+          </w:p>
+        </w:tc>
+        <w:tc>
+          <w:tcPr>
+            <w:tcW w:type="dxa" w:w="1870"/>
+            <w:vAlign w:val="center"/>
+          </w:tcPr>
+          <w:p>
+            <w:pPr>
+              <w:spacing w:after="0"/>
+            </w:pPr>
+            <w:r>
+              <w:rPr>
+                <w:rFonts w:ascii="Aptos" w:hAnsi="Aptos"/>
+                <w:sz w:val="16"/>
+              </w:rPr>
+              <w:t>27</w:t>
+            </w:r>
+          </w:p>
+        </w:tc>
+        <w:tc>
+          <w:tcPr>
+            <w:tcW w:type="dxa" w:w="1870"/>
+            <w:vAlign w:val="center"/>
+          </w:tcPr>
+          <w:p>
+            <w:pPr>
+              <w:spacing w:after="0"/>
+            </w:pPr>
+            <w:r>
+              <w:rPr>
+                <w:rFonts w:ascii="Aptos" w:hAnsi="Aptos"/>
+                <w:sz w:val="16"/>
+              </w:rPr>
+              <w:t>no_matched_case_ids</w:t>
             </w:r>
           </w:p>
         </w:tc>
@@ -2396,7 +2627,7 @@
         </w:trPr>
         <w:tc>
           <w:tcPr>
-            <w:tcW w:type="dxa" w:w="2992"/>
+            <w:tcW w:type="dxa" w:w="1870"/>
             <w:vAlign w:val="center"/>
             <w:shd w:fill="EEF4F8"/>
           </w:tcPr>
@@ -2415,7 +2646,7 @@
         </w:tc>
         <w:tc>
           <w:tcPr>
-            <w:tcW w:type="dxa" w:w="2992"/>
+            <w:tcW w:type="dxa" w:w="1870"/>
             <w:vAlign w:val="center"/>
             <w:shd w:fill="EEF4F8"/>
           </w:tcPr>
@@ -2434,7 +2665,7 @@
         </w:tc>
         <w:tc>
           <w:tcPr>
-            <w:tcW w:type="dxa" w:w="2992"/>
+            <w:tcW w:type="dxa" w:w="1870"/>
             <w:vAlign w:val="center"/>
             <w:shd w:fill="EEF4F8"/>
           </w:tcPr>
@@ -2453,7 +2684,7 @@
         </w:tc>
         <w:tc>
           <w:tcPr>
-            <w:tcW w:type="dxa" w:w="2992"/>
+            <w:tcW w:type="dxa" w:w="1870"/>
             <w:vAlign w:val="center"/>
             <w:shd w:fill="EEF4F8"/>
           </w:tcPr>
@@ -2472,20 +2703,77 @@
         </w:tc>
         <w:tc>
           <w:tcPr>
-            <w:tcW w:type="dxa" w:w="2992"/>
-            <w:vAlign w:val="center"/>
-            <w:shd w:fill="EEF4F8"/>
-          </w:tcPr>
-          <w:p>
-            <w:pPr>
-              <w:spacing w:after="0"/>
-            </w:pPr>
-            <w:r>
-              <w:rPr>
-                <w:rFonts w:ascii="Aptos" w:hAnsi="Aptos"/>
-                <w:sz w:val="16"/>
-              </w:rPr>
-              <w:t>["model_mismatch","backend_class_mismatch","prompt_set_mismatch","rubric_mismatch","scoring_version_mismatch","denominator_mismatch","aggregation_mismatch"]</w:t>
+            <w:tcW w:type="dxa" w:w="1870"/>
+            <w:vAlign w:val="center"/>
+            <w:shd w:fill="EEF4F8"/>
+          </w:tcPr>
+          <w:p>
+            <w:pPr>
+              <w:spacing w:after="0"/>
+            </w:pPr>
+            <w:r>
+              <w:rPr>
+                <w:rFonts w:ascii="Aptos" w:hAnsi="Aptos"/>
+                <w:sz w:val="16"/>
+              </w:rPr>
+              <w:t>0</w:t>
+            </w:r>
+          </w:p>
+        </w:tc>
+        <w:tc>
+          <w:tcPr>
+            <w:tcW w:type="dxa" w:w="1870"/>
+            <w:vAlign w:val="center"/>
+            <w:shd w:fill="EEF4F8"/>
+          </w:tcPr>
+          <w:p>
+            <w:pPr>
+              <w:spacing w:after="0"/>
+            </w:pPr>
+            <w:r>
+              <w:rPr>
+                <w:rFonts w:ascii="Aptos" w:hAnsi="Aptos"/>
+                <w:sz w:val="16"/>
+              </w:rPr>
+              <w:t>7</w:t>
+            </w:r>
+          </w:p>
+        </w:tc>
+        <w:tc>
+          <w:tcPr>
+            <w:tcW w:type="dxa" w:w="1870"/>
+            <w:vAlign w:val="center"/>
+            <w:shd w:fill="EEF4F8"/>
+          </w:tcPr>
+          <w:p>
+            <w:pPr>
+              <w:spacing w:after="0"/>
+            </w:pPr>
+            <w:r>
+              <w:rPr>
+                <w:rFonts w:ascii="Aptos" w:hAnsi="Aptos"/>
+                <w:sz w:val="16"/>
+              </w:rPr>
+              <w:t>27</w:t>
+            </w:r>
+          </w:p>
+        </w:tc>
+        <w:tc>
+          <w:tcPr>
+            <w:tcW w:type="dxa" w:w="1870"/>
+            <w:vAlign w:val="center"/>
+            <w:shd w:fill="EEF4F8"/>
+          </w:tcPr>
+          <w:p>
+            <w:pPr>
+              <w:spacing w:after="0"/>
+            </w:pPr>
+            <w:r>
+              <w:rPr>
+                <w:rFonts w:ascii="Aptos" w:hAnsi="Aptos"/>
+                <w:sz w:val="16"/>
+              </w:rPr>
+              <w:t>no_matched_case_ids; +8 more (see catalog CSV)</w:t>
             </w:r>
           </w:p>
         </w:tc>
@@ -2496,7 +2784,7 @@
         </w:trPr>
         <w:tc>
           <w:tcPr>
-            <w:tcW w:type="dxa" w:w="2992"/>
+            <w:tcW w:type="dxa" w:w="1870"/>
             <w:vAlign w:val="center"/>
           </w:tcPr>
           <w:p>
@@ -2514,7 +2802,7 @@
         </w:tc>
         <w:tc>
           <w:tcPr>
-            <w:tcW w:type="dxa" w:w="2992"/>
+            <w:tcW w:type="dxa" w:w="1870"/>
             <w:vAlign w:val="center"/>
           </w:tcPr>
           <w:p>
@@ -2532,7 +2820,7 @@
         </w:tc>
         <w:tc>
           <w:tcPr>
-            <w:tcW w:type="dxa" w:w="2992"/>
+            <w:tcW w:type="dxa" w:w="1870"/>
             <w:vAlign w:val="center"/>
           </w:tcPr>
           <w:p>
@@ -2550,7 +2838,7 @@
         </w:tc>
         <w:tc>
           <w:tcPr>
-            <w:tcW w:type="dxa" w:w="2992"/>
+            <w:tcW w:type="dxa" w:w="1870"/>
             <w:vAlign w:val="center"/>
           </w:tcPr>
           <w:p>
@@ -2568,19 +2856,73 @@
         </w:tc>
         <w:tc>
           <w:tcPr>
-            <w:tcW w:type="dxa" w:w="2992"/>
-            <w:vAlign w:val="center"/>
-          </w:tcPr>
-          <w:p>
-            <w:pPr>
-              <w:spacing w:after="0"/>
-            </w:pPr>
-            <w:r>
-              <w:rPr>
-                <w:rFonts w:ascii="Aptos" w:hAnsi="Aptos"/>
-                <w:sz w:val="16"/>
-              </w:rPr>
-              <w:t>["model_mismatch","input_length_mismatch","output_length_mismatch","backend_class_mismatch","repetition_treatment_mismatch"]</w:t>
+            <w:tcW w:type="dxa" w:w="1870"/>
+            <w:vAlign w:val="center"/>
+          </w:tcPr>
+          <w:p>
+            <w:pPr>
+              <w:spacing w:after="0"/>
+            </w:pPr>
+            <w:r>
+              <w:rPr>
+                <w:rFonts w:ascii="Aptos" w:hAnsi="Aptos"/>
+                <w:sz w:val="16"/>
+              </w:rPr>
+              <w:t>0</w:t>
+            </w:r>
+          </w:p>
+        </w:tc>
+        <w:tc>
+          <w:tcPr>
+            <w:tcW w:type="dxa" w:w="1870"/>
+            <w:vAlign w:val="center"/>
+          </w:tcPr>
+          <w:p>
+            <w:pPr>
+              <w:spacing w:after="0"/>
+            </w:pPr>
+            <w:r>
+              <w:rPr>
+                <w:rFonts w:ascii="Aptos" w:hAnsi="Aptos"/>
+                <w:sz w:val="16"/>
+              </w:rPr>
+              <w:t>7</w:t>
+            </w:r>
+          </w:p>
+        </w:tc>
+        <w:tc>
+          <w:tcPr>
+            <w:tcW w:type="dxa" w:w="1870"/>
+            <w:vAlign w:val="center"/>
+          </w:tcPr>
+          <w:p>
+            <w:pPr>
+              <w:spacing w:after="0"/>
+            </w:pPr>
+            <w:r>
+              <w:rPr>
+                <w:rFonts w:ascii="Aptos" w:hAnsi="Aptos"/>
+                <w:sz w:val="16"/>
+              </w:rPr>
+              <w:t>15</w:t>
+            </w:r>
+          </w:p>
+        </w:tc>
+        <w:tc>
+          <w:tcPr>
+            <w:tcW w:type="dxa" w:w="1870"/>
+            <w:vAlign w:val="center"/>
+          </w:tcPr>
+          <w:p>
+            <w:pPr>
+              <w:spacing w:after="0"/>
+            </w:pPr>
+            <w:r>
+              <w:rPr>
+                <w:rFonts w:ascii="Aptos" w:hAnsi="Aptos"/>
+                <w:sz w:val="16"/>
+              </w:rPr>
+              <w:t>no_matched_case_ids</w:t>
             </w:r>
           </w:p>
         </w:tc>
@@ -2591,7 +2933,7 @@
         </w:trPr>
         <w:tc>
           <w:tcPr>
-            <w:tcW w:type="dxa" w:w="2992"/>
+            <w:tcW w:type="dxa" w:w="1870"/>
             <w:vAlign w:val="center"/>
             <w:shd w:fill="EEF4F8"/>
           </w:tcPr>
@@ -2610,7 +2952,7 @@
         </w:tc>
         <w:tc>
           <w:tcPr>
-            <w:tcW w:type="dxa" w:w="2992"/>
+            <w:tcW w:type="dxa" w:w="1870"/>
             <w:vAlign w:val="center"/>
             <w:shd w:fill="EEF4F8"/>
           </w:tcPr>
@@ -2629,7 +2971,7 @@
         </w:tc>
         <w:tc>
           <w:tcPr>
-            <w:tcW w:type="dxa" w:w="2992"/>
+            <w:tcW w:type="dxa" w:w="1870"/>
             <w:vAlign w:val="center"/>
             <w:shd w:fill="EEF4F8"/>
           </w:tcPr>
@@ -2648,7 +2990,7 @@
         </w:tc>
         <w:tc>
           <w:tcPr>
-            <w:tcW w:type="dxa" w:w="2992"/>
+            <w:tcW w:type="dxa" w:w="1870"/>
             <w:vAlign w:val="center"/>
             <w:shd w:fill="EEF4F8"/>
           </w:tcPr>
@@ -2667,20 +3009,77 @@
         </w:tc>
         <w:tc>
           <w:tcPr>
-            <w:tcW w:type="dxa" w:w="2992"/>
-            <w:vAlign w:val="center"/>
-            <w:shd w:fill="EEF4F8"/>
-          </w:tcPr>
-          <w:p>
-            <w:pPr>
-              <w:spacing w:after="0"/>
-            </w:pPr>
-            <w:r>
-              <w:rPr>
-                <w:rFonts w:ascii="Aptos" w:hAnsi="Aptos"/>
-                <w:sz w:val="16"/>
-              </w:rPr>
-              <w:t>["model_mismatch","backend_class_mismatch","prompt_set_mismatch","rubric_mismatch","scoring_version_mismatch","denominator_mismatch","aggregation_mismatch"]</w:t>
+            <w:tcW w:type="dxa" w:w="1870"/>
+            <w:vAlign w:val="center"/>
+            <w:shd w:fill="EEF4F8"/>
+          </w:tcPr>
+          <w:p>
+            <w:pPr>
+              <w:spacing w:after="0"/>
+            </w:pPr>
+            <w:r>
+              <w:rPr>
+                <w:rFonts w:ascii="Aptos" w:hAnsi="Aptos"/>
+                <w:sz w:val="16"/>
+              </w:rPr>
+              <w:t>0</w:t>
+            </w:r>
+          </w:p>
+        </w:tc>
+        <w:tc>
+          <w:tcPr>
+            <w:tcW w:type="dxa" w:w="1870"/>
+            <w:vAlign w:val="center"/>
+            <w:shd w:fill="EEF4F8"/>
+          </w:tcPr>
+          <w:p>
+            <w:pPr>
+              <w:spacing w:after="0"/>
+            </w:pPr>
+            <w:r>
+              <w:rPr>
+                <w:rFonts w:ascii="Aptos" w:hAnsi="Aptos"/>
+                <w:sz w:val="16"/>
+              </w:rPr>
+              <w:t>7</w:t>
+            </w:r>
+          </w:p>
+        </w:tc>
+        <w:tc>
+          <w:tcPr>
+            <w:tcW w:type="dxa" w:w="1870"/>
+            <w:vAlign w:val="center"/>
+            <w:shd w:fill="EEF4F8"/>
+          </w:tcPr>
+          <w:p>
+            <w:pPr>
+              <w:spacing w:after="0"/>
+            </w:pPr>
+            <w:r>
+              <w:rPr>
+                <w:rFonts w:ascii="Aptos" w:hAnsi="Aptos"/>
+                <w:sz w:val="16"/>
+              </w:rPr>
+              <w:t>15</w:t>
+            </w:r>
+          </w:p>
+        </w:tc>
+        <w:tc>
+          <w:tcPr>
+            <w:tcW w:type="dxa" w:w="1870"/>
+            <w:vAlign w:val="center"/>
+            <w:shd w:fill="EEF4F8"/>
+          </w:tcPr>
+          <w:p>
+            <w:pPr>
+              <w:spacing w:after="0"/>
+            </w:pPr>
+            <w:r>
+              <w:rPr>
+                <w:rFonts w:ascii="Aptos" w:hAnsi="Aptos"/>
+                <w:sz w:val="16"/>
+              </w:rPr>
+              <w:t>no_matched_case_ids; +8 more (see catalog CSV)</w:t>
             </w:r>
           </w:p>
         </w:tc>
@@ -2691,7 +3090,7 @@
         </w:trPr>
         <w:tc>
           <w:tcPr>
-            <w:tcW w:type="dxa" w:w="2992"/>
+            <w:tcW w:type="dxa" w:w="1870"/>
             <w:vAlign w:val="center"/>
           </w:tcPr>
           <w:p>
@@ -2709,7 +3108,7 @@
         </w:tc>
         <w:tc>
           <w:tcPr>
-            <w:tcW w:type="dxa" w:w="2992"/>
+            <w:tcW w:type="dxa" w:w="1870"/>
             <w:vAlign w:val="center"/>
           </w:tcPr>
           <w:p>
@@ -2727,7 +3126,7 @@
         </w:tc>
         <w:tc>
           <w:tcPr>
-            <w:tcW w:type="dxa" w:w="2992"/>
+            <w:tcW w:type="dxa" w:w="1870"/>
             <w:vAlign w:val="center"/>
           </w:tcPr>
           <w:p>
@@ -2745,7 +3144,7 @@
         </w:tc>
         <w:tc>
           <w:tcPr>
-            <w:tcW w:type="dxa" w:w="2992"/>
+            <w:tcW w:type="dxa" w:w="1870"/>
             <w:vAlign w:val="center"/>
           </w:tcPr>
           <w:p>
@@ -2763,19 +3162,73 @@
         </w:tc>
         <w:tc>
           <w:tcPr>
-            <w:tcW w:type="dxa" w:w="2992"/>
-            <w:vAlign w:val="center"/>
-          </w:tcPr>
-          <w:p>
-            <w:pPr>
-              <w:spacing w:after="0"/>
-            </w:pPr>
-            <w:r>
-              <w:rPr>
-                <w:rFonts w:ascii="Aptos" w:hAnsi="Aptos"/>
-                <w:sz w:val="16"/>
-              </w:rPr>
-              <w:t>["model_mismatch","input_length_mismatch","output_length_mismatch","repetition_treatment_mismatch","input_length_missing","output_length_missing"]</w:t>
+            <w:tcW w:type="dxa" w:w="1870"/>
+            <w:vAlign w:val="center"/>
+          </w:tcPr>
+          <w:p>
+            <w:pPr>
+              <w:spacing w:after="0"/>
+            </w:pPr>
+            <w:r>
+              <w:rPr>
+                <w:rFonts w:ascii="Aptos" w:hAnsi="Aptos"/>
+                <w:sz w:val="16"/>
+              </w:rPr>
+              <w:t>0</w:t>
+            </w:r>
+          </w:p>
+        </w:tc>
+        <w:tc>
+          <w:tcPr>
+            <w:tcW w:type="dxa" w:w="1870"/>
+            <w:vAlign w:val="center"/>
+          </w:tcPr>
+          <w:p>
+            <w:pPr>
+              <w:spacing w:after="0"/>
+            </w:pPr>
+            <w:r>
+              <w:rPr>
+                <w:rFonts w:ascii="Aptos" w:hAnsi="Aptos"/>
+                <w:sz w:val="16"/>
+              </w:rPr>
+              <w:t>7</w:t>
+            </w:r>
+          </w:p>
+        </w:tc>
+        <w:tc>
+          <w:tcPr>
+            <w:tcW w:type="dxa" w:w="1870"/>
+            <w:vAlign w:val="center"/>
+          </w:tcPr>
+          <w:p>
+            <w:pPr>
+              <w:spacing w:after="0"/>
+            </w:pPr>
+            <w:r>
+              <w:rPr>
+                <w:rFonts w:ascii="Aptos" w:hAnsi="Aptos"/>
+                <w:sz w:val="16"/>
+              </w:rPr>
+              <w:t>13</w:t>
+            </w:r>
+          </w:p>
+        </w:tc>
+        <w:tc>
+          <w:tcPr>
+            <w:tcW w:type="dxa" w:w="1870"/>
+            <w:vAlign w:val="center"/>
+          </w:tcPr>
+          <w:p>
+            <w:pPr>
+              <w:spacing w:after="0"/>
+            </w:pPr>
+            <w:r>
+              <w:rPr>
+                <w:rFonts w:ascii="Aptos" w:hAnsi="Aptos"/>
+                <w:sz w:val="16"/>
+              </w:rPr>
+              <w:t>no_matched_case_ids</w:t>
             </w:r>
           </w:p>
         </w:tc>
@@ -2786,7 +3239,7 @@
         </w:trPr>
         <w:tc>
           <w:tcPr>
-            <w:tcW w:type="dxa" w:w="2992"/>
+            <w:tcW w:type="dxa" w:w="1870"/>
             <w:vAlign w:val="center"/>
             <w:shd w:fill="EEF4F8"/>
           </w:tcPr>
@@ -2805,7 +3258,7 @@
         </w:tc>
         <w:tc>
           <w:tcPr>
-            <w:tcW w:type="dxa" w:w="2992"/>
+            <w:tcW w:type="dxa" w:w="1870"/>
             <w:vAlign w:val="center"/>
             <w:shd w:fill="EEF4F8"/>
           </w:tcPr>
@@ -2824,7 +3277,7 @@
         </w:tc>
         <w:tc>
           <w:tcPr>
-            <w:tcW w:type="dxa" w:w="2992"/>
+            <w:tcW w:type="dxa" w:w="1870"/>
             <w:vAlign w:val="center"/>
             <w:shd w:fill="EEF4F8"/>
           </w:tcPr>
@@ -2843,7 +3296,7 @@
         </w:tc>
         <w:tc>
           <w:tcPr>
-            <w:tcW w:type="dxa" w:w="2992"/>
+            <w:tcW w:type="dxa" w:w="1870"/>
             <w:vAlign w:val="center"/>
             <w:shd w:fill="EEF4F8"/>
           </w:tcPr>
@@ -2862,20 +3315,77 @@
         </w:tc>
         <w:tc>
           <w:tcPr>
-            <w:tcW w:type="dxa" w:w="2992"/>
-            <w:vAlign w:val="center"/>
-            <w:shd w:fill="EEF4F8"/>
-          </w:tcPr>
-          <w:p>
-            <w:pPr>
-              <w:spacing w:after="0"/>
-            </w:pPr>
-            <w:r>
-              <w:rPr>
-                <w:rFonts w:ascii="Aptos" w:hAnsi="Aptos"/>
-                <w:sz w:val="16"/>
-              </w:rPr>
-              <w:t>["model_mismatch","scoring_version_mismatch","denominator_mismatch"]</w:t>
+            <w:tcW w:type="dxa" w:w="1870"/>
+            <w:vAlign w:val="center"/>
+            <w:shd w:fill="EEF4F8"/>
+          </w:tcPr>
+          <w:p>
+            <w:pPr>
+              <w:spacing w:after="0"/>
+            </w:pPr>
+            <w:r>
+              <w:rPr>
+                <w:rFonts w:ascii="Aptos" w:hAnsi="Aptos"/>
+                <w:sz w:val="16"/>
+              </w:rPr>
+              <w:t>0</w:t>
+            </w:r>
+          </w:p>
+        </w:tc>
+        <w:tc>
+          <w:tcPr>
+            <w:tcW w:type="dxa" w:w="1870"/>
+            <w:vAlign w:val="center"/>
+            <w:shd w:fill="EEF4F8"/>
+          </w:tcPr>
+          <w:p>
+            <w:pPr>
+              <w:spacing w:after="0"/>
+            </w:pPr>
+            <w:r>
+              <w:rPr>
+                <w:rFonts w:ascii="Aptos" w:hAnsi="Aptos"/>
+                <w:sz w:val="16"/>
+              </w:rPr>
+              <w:t>7</w:t>
+            </w:r>
+          </w:p>
+        </w:tc>
+        <w:tc>
+          <w:tcPr>
+            <w:tcW w:type="dxa" w:w="1870"/>
+            <w:vAlign w:val="center"/>
+            <w:shd w:fill="EEF4F8"/>
+          </w:tcPr>
+          <w:p>
+            <w:pPr>
+              <w:spacing w:after="0"/>
+            </w:pPr>
+            <w:r>
+              <w:rPr>
+                <w:rFonts w:ascii="Aptos" w:hAnsi="Aptos"/>
+                <w:sz w:val="16"/>
+              </w:rPr>
+              <w:t>13</w:t>
+            </w:r>
+          </w:p>
+        </w:tc>
+        <w:tc>
+          <w:tcPr>
+            <w:tcW w:type="dxa" w:w="1870"/>
+            <w:vAlign w:val="center"/>
+            <w:shd w:fill="EEF4F8"/>
+          </w:tcPr>
+          <w:p>
+            <w:pPr>
+              <w:spacing w:after="0"/>
+            </w:pPr>
+            <w:r>
+              <w:rPr>
+                <w:rFonts w:ascii="Aptos" w:hAnsi="Aptos"/>
+                <w:sz w:val="16"/>
+              </w:rPr>
+              <w:t>no_matched_case_ids; +4 more (see catalog CSV)</w:t>
             </w:r>
           </w:p>
         </w:tc>
@@ -2886,7 +3396,7 @@
         </w:trPr>
         <w:tc>
           <w:tcPr>
-            <w:tcW w:type="dxa" w:w="2992"/>
+            <w:tcW w:type="dxa" w:w="1870"/>
             <w:vAlign w:val="center"/>
           </w:tcPr>
           <w:p>
@@ -2904,7 +3414,7 @@
         </w:tc>
         <w:tc>
           <w:tcPr>
-            <w:tcW w:type="dxa" w:w="2992"/>
+            <w:tcW w:type="dxa" w:w="1870"/>
             <w:vAlign w:val="center"/>
           </w:tcPr>
           <w:p>
@@ -2922,7 +3432,7 @@
         </w:tc>
         <w:tc>
           <w:tcPr>
-            <w:tcW w:type="dxa" w:w="2992"/>
+            <w:tcW w:type="dxa" w:w="1870"/>
             <w:vAlign w:val="center"/>
           </w:tcPr>
           <w:p>
@@ -2940,7 +3450,7 @@
         </w:tc>
         <w:tc>
           <w:tcPr>
-            <w:tcW w:type="dxa" w:w="2992"/>
+            <w:tcW w:type="dxa" w:w="1870"/>
             <w:vAlign w:val="center"/>
           </w:tcPr>
           <w:p>
@@ -2958,19 +3468,73 @@
         </w:tc>
         <w:tc>
           <w:tcPr>
-            <w:tcW w:type="dxa" w:w="2992"/>
-            <w:vAlign w:val="center"/>
-          </w:tcPr>
-          <w:p>
-            <w:pPr>
-              <w:spacing w:after="0"/>
-            </w:pPr>
-            <w:r>
-              <w:rPr>
-                <w:rFonts w:ascii="Aptos" w:hAnsi="Aptos"/>
-                <w:sz w:val="16"/>
-              </w:rPr>
-              <w:t>["model_mismatch","input_length_mismatch","output_length_mismatch","backend_class_mismatch","repetition_treatment_mismatch","input_length_missing","output_length_missing"]</w:t>
+            <w:tcW w:type="dxa" w:w="1870"/>
+            <w:vAlign w:val="center"/>
+          </w:tcPr>
+          <w:p>
+            <w:pPr>
+              <w:spacing w:after="0"/>
+            </w:pPr>
+            <w:r>
+              <w:rPr>
+                <w:rFonts w:ascii="Aptos" w:hAnsi="Aptos"/>
+                <w:sz w:val="16"/>
+              </w:rPr>
+              <w:t>0</w:t>
+            </w:r>
+          </w:p>
+        </w:tc>
+        <w:tc>
+          <w:tcPr>
+            <w:tcW w:type="dxa" w:w="1870"/>
+            <w:vAlign w:val="center"/>
+          </w:tcPr>
+          <w:p>
+            <w:pPr>
+              <w:spacing w:after="0"/>
+            </w:pPr>
+            <w:r>
+              <w:rPr>
+                <w:rFonts w:ascii="Aptos" w:hAnsi="Aptos"/>
+                <w:sz w:val="16"/>
+              </w:rPr>
+              <w:t>19</w:t>
+            </w:r>
+          </w:p>
+        </w:tc>
+        <w:tc>
+          <w:tcPr>
+            <w:tcW w:type="dxa" w:w="1870"/>
+            <w:vAlign w:val="center"/>
+          </w:tcPr>
+          <w:p>
+            <w:pPr>
+              <w:spacing w:after="0"/>
+            </w:pPr>
+            <w:r>
+              <w:rPr>
+                <w:rFonts w:ascii="Aptos" w:hAnsi="Aptos"/>
+                <w:sz w:val="16"/>
+              </w:rPr>
+              <w:t>27</w:t>
+            </w:r>
+          </w:p>
+        </w:tc>
+        <w:tc>
+          <w:tcPr>
+            <w:tcW w:type="dxa" w:w="1870"/>
+            <w:vAlign w:val="center"/>
+          </w:tcPr>
+          <w:p>
+            <w:pPr>
+              <w:spacing w:after="0"/>
+            </w:pPr>
+            <w:r>
+              <w:rPr>
+                <w:rFonts w:ascii="Aptos" w:hAnsi="Aptos"/>
+                <w:sz w:val="16"/>
+              </w:rPr>
+              <w:t>no_matched_case_ids</w:t>
             </w:r>
           </w:p>
         </w:tc>
@@ -2981,7 +3545,7 @@
         </w:trPr>
         <w:tc>
           <w:tcPr>
-            <w:tcW w:type="dxa" w:w="2992"/>
+            <w:tcW w:type="dxa" w:w="1870"/>
             <w:vAlign w:val="center"/>
             <w:shd w:fill="EEF4F8"/>
           </w:tcPr>
@@ -3000,7 +3564,7 @@
         </w:tc>
         <w:tc>
           <w:tcPr>
-            <w:tcW w:type="dxa" w:w="2992"/>
+            <w:tcW w:type="dxa" w:w="1870"/>
             <w:vAlign w:val="center"/>
             <w:shd w:fill="EEF4F8"/>
           </w:tcPr>
@@ -3019,7 +3583,7 @@
         </w:tc>
         <w:tc>
           <w:tcPr>
-            <w:tcW w:type="dxa" w:w="2992"/>
+            <w:tcW w:type="dxa" w:w="1870"/>
             <w:vAlign w:val="center"/>
             <w:shd w:fill="EEF4F8"/>
           </w:tcPr>
@@ -3038,7 +3602,7 @@
         </w:tc>
         <w:tc>
           <w:tcPr>
-            <w:tcW w:type="dxa" w:w="2992"/>
+            <w:tcW w:type="dxa" w:w="1870"/>
             <w:vAlign w:val="center"/>
             <w:shd w:fill="EEF4F8"/>
           </w:tcPr>
@@ -3057,20 +3621,77 @@
         </w:tc>
         <w:tc>
           <w:tcPr>
-            <w:tcW w:type="dxa" w:w="2992"/>
-            <w:vAlign w:val="center"/>
-            <w:shd w:fill="EEF4F8"/>
-          </w:tcPr>
-          <w:p>
-            <w:pPr>
-              <w:spacing w:after="0"/>
-            </w:pPr>
-            <w:r>
-              <w:rPr>
-                <w:rFonts w:ascii="Aptos" w:hAnsi="Aptos"/>
-                <w:sz w:val="16"/>
-              </w:rPr>
-              <w:t>["model_mismatch","backend_class_mismatch","prompt_set_mismatch","rubric_mismatch","scoring_version_mismatch","denominator_mismatch","aggregation_mismatch"]</w:t>
+            <w:tcW w:type="dxa" w:w="1870"/>
+            <w:vAlign w:val="center"/>
+            <w:shd w:fill="EEF4F8"/>
+          </w:tcPr>
+          <w:p>
+            <w:pPr>
+              <w:spacing w:after="0"/>
+            </w:pPr>
+            <w:r>
+              <w:rPr>
+                <w:rFonts w:ascii="Aptos" w:hAnsi="Aptos"/>
+                <w:sz w:val="16"/>
+              </w:rPr>
+              <w:t>0</w:t>
+            </w:r>
+          </w:p>
+        </w:tc>
+        <w:tc>
+          <w:tcPr>
+            <w:tcW w:type="dxa" w:w="1870"/>
+            <w:vAlign w:val="center"/>
+            <w:shd w:fill="EEF4F8"/>
+          </w:tcPr>
+          <w:p>
+            <w:pPr>
+              <w:spacing w:after="0"/>
+            </w:pPr>
+            <w:r>
+              <w:rPr>
+                <w:rFonts w:ascii="Aptos" w:hAnsi="Aptos"/>
+                <w:sz w:val="16"/>
+              </w:rPr>
+              <w:t>19</w:t>
+            </w:r>
+          </w:p>
+        </w:tc>
+        <w:tc>
+          <w:tcPr>
+            <w:tcW w:type="dxa" w:w="1870"/>
+            <w:vAlign w:val="center"/>
+            <w:shd w:fill="EEF4F8"/>
+          </w:tcPr>
+          <w:p>
+            <w:pPr>
+              <w:spacing w:after="0"/>
+            </w:pPr>
+            <w:r>
+              <w:rPr>
+                <w:rFonts w:ascii="Aptos" w:hAnsi="Aptos"/>
+                <w:sz w:val="16"/>
+              </w:rPr>
+              <w:t>27</w:t>
+            </w:r>
+          </w:p>
+        </w:tc>
+        <w:tc>
+          <w:tcPr>
+            <w:tcW w:type="dxa" w:w="1870"/>
+            <w:vAlign w:val="center"/>
+            <w:shd w:fill="EEF4F8"/>
+          </w:tcPr>
+          <w:p>
+            <w:pPr>
+              <w:spacing w:after="0"/>
+            </w:pPr>
+            <w:r>
+              <w:rPr>
+                <w:rFonts w:ascii="Aptos" w:hAnsi="Aptos"/>
+                <w:sz w:val="16"/>
+              </w:rPr>
+              <w:t>no_matched_case_ids; +8 more (see catalog CSV)</w:t>
             </w:r>
           </w:p>
         </w:tc>
@@ -3081,7 +3702,7 @@
         </w:trPr>
         <w:tc>
           <w:tcPr>
-            <w:tcW w:type="dxa" w:w="2992"/>
+            <w:tcW w:type="dxa" w:w="1870"/>
             <w:vAlign w:val="center"/>
           </w:tcPr>
           <w:p>
@@ -3099,7 +3720,7 @@
         </w:tc>
         <w:tc>
           <w:tcPr>
-            <w:tcW w:type="dxa" w:w="2992"/>
+            <w:tcW w:type="dxa" w:w="1870"/>
             <w:vAlign w:val="center"/>
           </w:tcPr>
           <w:p>
@@ -3117,7 +3738,7 @@
         </w:tc>
         <w:tc>
           <w:tcPr>
-            <w:tcW w:type="dxa" w:w="2992"/>
+            <w:tcW w:type="dxa" w:w="1870"/>
             <w:vAlign w:val="center"/>
           </w:tcPr>
           <w:p>
@@ -3135,7 +3756,7 @@
         </w:tc>
         <w:tc>
           <w:tcPr>
-            <w:tcW w:type="dxa" w:w="2992"/>
+            <w:tcW w:type="dxa" w:w="1870"/>
             <w:vAlign w:val="center"/>
           </w:tcPr>
           <w:p>
@@ -3153,19 +3774,73 @@
         </w:tc>
         <w:tc>
           <w:tcPr>
-            <w:tcW w:type="dxa" w:w="2992"/>
-            <w:vAlign w:val="center"/>
-          </w:tcPr>
-          <w:p>
-            <w:pPr>
-              <w:spacing w:after="0"/>
-            </w:pPr>
-            <w:r>
-              <w:rPr>
-                <w:rFonts w:ascii="Aptos" w:hAnsi="Aptos"/>
-                <w:sz w:val="16"/>
-              </w:rPr>
-              <w:t>["model_mismatch","input_length_mismatch","output_length_mismatch","backend_class_mismatch","repetition_treatment_mismatch","input_length_missing","output_length_missing"]</w:t>
+            <w:tcW w:type="dxa" w:w="1870"/>
+            <w:vAlign w:val="center"/>
+          </w:tcPr>
+          <w:p>
+            <w:pPr>
+              <w:spacing w:after="0"/>
+            </w:pPr>
+            <w:r>
+              <w:rPr>
+                <w:rFonts w:ascii="Aptos" w:hAnsi="Aptos"/>
+                <w:sz w:val="16"/>
+              </w:rPr>
+              <w:t>0</w:t>
+            </w:r>
+          </w:p>
+        </w:tc>
+        <w:tc>
+          <w:tcPr>
+            <w:tcW w:type="dxa" w:w="1870"/>
+            <w:vAlign w:val="center"/>
+          </w:tcPr>
+          <w:p>
+            <w:pPr>
+              <w:spacing w:after="0"/>
+            </w:pPr>
+            <w:r>
+              <w:rPr>
+                <w:rFonts w:ascii="Aptos" w:hAnsi="Aptos"/>
+                <w:sz w:val="16"/>
+              </w:rPr>
+              <w:t>19</w:t>
+            </w:r>
+          </w:p>
+        </w:tc>
+        <w:tc>
+          <w:tcPr>
+            <w:tcW w:type="dxa" w:w="1870"/>
+            <w:vAlign w:val="center"/>
+          </w:tcPr>
+          <w:p>
+            <w:pPr>
+              <w:spacing w:after="0"/>
+            </w:pPr>
+            <w:r>
+              <w:rPr>
+                <w:rFonts w:ascii="Aptos" w:hAnsi="Aptos"/>
+                <w:sz w:val="16"/>
+              </w:rPr>
+              <w:t>15</w:t>
+            </w:r>
+          </w:p>
+        </w:tc>
+        <w:tc>
+          <w:tcPr>
+            <w:tcW w:type="dxa" w:w="1870"/>
+            <w:vAlign w:val="center"/>
+          </w:tcPr>
+          <w:p>
+            <w:pPr>
+              <w:spacing w:after="0"/>
+            </w:pPr>
+            <w:r>
+              <w:rPr>
+                <w:rFonts w:ascii="Aptos" w:hAnsi="Aptos"/>
+                <w:sz w:val="16"/>
+              </w:rPr>
+              <w:t>no_matched_case_ids</w:t>
             </w:r>
           </w:p>
         </w:tc>
@@ -3176,7 +3851,7 @@
         </w:trPr>
         <w:tc>
           <w:tcPr>
-            <w:tcW w:type="dxa" w:w="2992"/>
+            <w:tcW w:type="dxa" w:w="1870"/>
             <w:vAlign w:val="center"/>
             <w:shd w:fill="EEF4F8"/>
           </w:tcPr>
@@ -3195,7 +3870,7 @@
         </w:tc>
         <w:tc>
           <w:tcPr>
-            <w:tcW w:type="dxa" w:w="2992"/>
+            <w:tcW w:type="dxa" w:w="1870"/>
             <w:vAlign w:val="center"/>
             <w:shd w:fill="EEF4F8"/>
           </w:tcPr>
@@ -3214,7 +3889,7 @@
         </w:tc>
         <w:tc>
           <w:tcPr>
-            <w:tcW w:type="dxa" w:w="2992"/>
+            <w:tcW w:type="dxa" w:w="1870"/>
             <w:vAlign w:val="center"/>
             <w:shd w:fill="EEF4F8"/>
           </w:tcPr>
@@ -3233,7 +3908,7 @@
         </w:tc>
         <w:tc>
           <w:tcPr>
-            <w:tcW w:type="dxa" w:w="2992"/>
+            <w:tcW w:type="dxa" w:w="1870"/>
             <w:vAlign w:val="center"/>
             <w:shd w:fill="EEF4F8"/>
           </w:tcPr>
@@ -3252,20 +3927,77 @@
         </w:tc>
         <w:tc>
           <w:tcPr>
-            <w:tcW w:type="dxa" w:w="2992"/>
-            <w:vAlign w:val="center"/>
-            <w:shd w:fill="EEF4F8"/>
-          </w:tcPr>
-          <w:p>
-            <w:pPr>
-              <w:spacing w:after="0"/>
-            </w:pPr>
-            <w:r>
-              <w:rPr>
-                <w:rFonts w:ascii="Aptos" w:hAnsi="Aptos"/>
-                <w:sz w:val="16"/>
-              </w:rPr>
-              <w:t>["model_mismatch","backend_class_mismatch","prompt_set_mismatch","rubric_mismatch","scoring_version_mismatch","denominator_mismatch","aggregation_mismatch"]</w:t>
+            <w:tcW w:type="dxa" w:w="1870"/>
+            <w:vAlign w:val="center"/>
+            <w:shd w:fill="EEF4F8"/>
+          </w:tcPr>
+          <w:p>
+            <w:pPr>
+              <w:spacing w:after="0"/>
+            </w:pPr>
+            <w:r>
+              <w:rPr>
+                <w:rFonts w:ascii="Aptos" w:hAnsi="Aptos"/>
+                <w:sz w:val="16"/>
+              </w:rPr>
+              <w:t>0</w:t>
+            </w:r>
+          </w:p>
+        </w:tc>
+        <w:tc>
+          <w:tcPr>
+            <w:tcW w:type="dxa" w:w="1870"/>
+            <w:vAlign w:val="center"/>
+            <w:shd w:fill="EEF4F8"/>
+          </w:tcPr>
+          <w:p>
+            <w:pPr>
+              <w:spacing w:after="0"/>
+            </w:pPr>
+            <w:r>
+              <w:rPr>
+                <w:rFonts w:ascii="Aptos" w:hAnsi="Aptos"/>
+                <w:sz w:val="16"/>
+              </w:rPr>
+              <w:t>19</w:t>
+            </w:r>
+          </w:p>
+        </w:tc>
+        <w:tc>
+          <w:tcPr>
+            <w:tcW w:type="dxa" w:w="1870"/>
+            <w:vAlign w:val="center"/>
+            <w:shd w:fill="EEF4F8"/>
+          </w:tcPr>
+          <w:p>
+            <w:pPr>
+              <w:spacing w:after="0"/>
+            </w:pPr>
+            <w:r>
+              <w:rPr>
+                <w:rFonts w:ascii="Aptos" w:hAnsi="Aptos"/>
+                <w:sz w:val="16"/>
+              </w:rPr>
+              <w:t>15</w:t>
+            </w:r>
+          </w:p>
+        </w:tc>
+        <w:tc>
+          <w:tcPr>
+            <w:tcW w:type="dxa" w:w="1870"/>
+            <w:vAlign w:val="center"/>
+            <w:shd w:fill="EEF4F8"/>
+          </w:tcPr>
+          <w:p>
+            <w:pPr>
+              <w:spacing w:after="0"/>
+            </w:pPr>
+            <w:r>
+              <w:rPr>
+                <w:rFonts w:ascii="Aptos" w:hAnsi="Aptos"/>
+                <w:sz w:val="16"/>
+              </w:rPr>
+              <w:t>no_matched_case_ids; +8 more (see catalog CSV)</w:t>
             </w:r>
           </w:p>
         </w:tc>
@@ -3276,7 +4008,7 @@
         </w:trPr>
         <w:tc>
           <w:tcPr>
-            <w:tcW w:type="dxa" w:w="2992"/>
+            <w:tcW w:type="dxa" w:w="1870"/>
             <w:vAlign w:val="center"/>
           </w:tcPr>
           <w:p>
@@ -3294,7 +4026,7 @@
         </w:tc>
         <w:tc>
           <w:tcPr>
-            <w:tcW w:type="dxa" w:w="2992"/>
+            <w:tcW w:type="dxa" w:w="1870"/>
             <w:vAlign w:val="center"/>
           </w:tcPr>
           <w:p>
@@ -3312,7 +4044,7 @@
         </w:tc>
         <w:tc>
           <w:tcPr>
-            <w:tcW w:type="dxa" w:w="2992"/>
+            <w:tcW w:type="dxa" w:w="1870"/>
             <w:vAlign w:val="center"/>
           </w:tcPr>
           <w:p>
@@ -3330,7 +4062,7 @@
         </w:tc>
         <w:tc>
           <w:tcPr>
-            <w:tcW w:type="dxa" w:w="2992"/>
+            <w:tcW w:type="dxa" w:w="1870"/>
             <w:vAlign w:val="center"/>
           </w:tcPr>
           <w:p>
@@ -3348,19 +4080,73 @@
         </w:tc>
         <w:tc>
           <w:tcPr>
-            <w:tcW w:type="dxa" w:w="2992"/>
-            <w:vAlign w:val="center"/>
-          </w:tcPr>
-          <w:p>
-            <w:pPr>
-              <w:spacing w:after="0"/>
-            </w:pPr>
-            <w:r>
-              <w:rPr>
-                <w:rFonts w:ascii="Aptos" w:hAnsi="Aptos"/>
-                <w:sz w:val="16"/>
-              </w:rPr>
-              <w:t>["repetition_treatment_mismatch","input_length_missing","output_length_missing"]</w:t>
+            <w:tcW w:type="dxa" w:w="1870"/>
+            <w:vAlign w:val="center"/>
+          </w:tcPr>
+          <w:p>
+            <w:pPr>
+              <w:spacing w:after="0"/>
+            </w:pPr>
+            <w:r>
+              <w:rPr>
+                <w:rFonts w:ascii="Aptos" w:hAnsi="Aptos"/>
+                <w:sz w:val="16"/>
+              </w:rPr>
+              <w:t>0</w:t>
+            </w:r>
+          </w:p>
+        </w:tc>
+        <w:tc>
+          <w:tcPr>
+            <w:tcW w:type="dxa" w:w="1870"/>
+            <w:vAlign w:val="center"/>
+          </w:tcPr>
+          <w:p>
+            <w:pPr>
+              <w:spacing w:after="0"/>
+            </w:pPr>
+            <w:r>
+              <w:rPr>
+                <w:rFonts w:ascii="Aptos" w:hAnsi="Aptos"/>
+                <w:sz w:val="16"/>
+              </w:rPr>
+              <w:t>19</w:t>
+            </w:r>
+          </w:p>
+        </w:tc>
+        <w:tc>
+          <w:tcPr>
+            <w:tcW w:type="dxa" w:w="1870"/>
+            <w:vAlign w:val="center"/>
+          </w:tcPr>
+          <w:p>
+            <w:pPr>
+              <w:spacing w:after="0"/>
+            </w:pPr>
+            <w:r>
+              <w:rPr>
+                <w:rFonts w:ascii="Aptos" w:hAnsi="Aptos"/>
+                <w:sz w:val="16"/>
+              </w:rPr>
+              <w:t>13</w:t>
+            </w:r>
+          </w:p>
+        </w:tc>
+        <w:tc>
+          <w:tcPr>
+            <w:tcW w:type="dxa" w:w="1870"/>
+            <w:vAlign w:val="center"/>
+          </w:tcPr>
+          <w:p>
+            <w:pPr>
+              <w:spacing w:after="0"/>
+            </w:pPr>
+            <w:r>
+              <w:rPr>
+                <w:rFonts w:ascii="Aptos" w:hAnsi="Aptos"/>
+                <w:sz w:val="16"/>
+              </w:rPr>
+              <w:t>no_matched_case_ids</w:t>
             </w:r>
           </w:p>
         </w:tc>
@@ -3371,7 +4157,7 @@
         </w:trPr>
         <w:tc>
           <w:tcPr>
-            <w:tcW w:type="dxa" w:w="2992"/>
+            <w:tcW w:type="dxa" w:w="1870"/>
             <w:vAlign w:val="center"/>
             <w:shd w:fill="EEF4F8"/>
           </w:tcPr>
@@ -3390,7 +4176,7 @@
         </w:tc>
         <w:tc>
           <w:tcPr>
-            <w:tcW w:type="dxa" w:w="2992"/>
+            <w:tcW w:type="dxa" w:w="1870"/>
             <w:vAlign w:val="center"/>
             <w:shd w:fill="EEF4F8"/>
           </w:tcPr>
@@ -3409,7 +4195,7 @@
         </w:tc>
         <w:tc>
           <w:tcPr>
-            <w:tcW w:type="dxa" w:w="2992"/>
+            <w:tcW w:type="dxa" w:w="1870"/>
             <w:vAlign w:val="center"/>
             <w:shd w:fill="EEF4F8"/>
           </w:tcPr>
@@ -3428,7 +4214,7 @@
         </w:tc>
         <w:tc>
           <w:tcPr>
-            <w:tcW w:type="dxa" w:w="2992"/>
+            <w:tcW w:type="dxa" w:w="1870"/>
             <w:vAlign w:val="center"/>
             <w:shd w:fill="EEF4F8"/>
           </w:tcPr>
@@ -3447,20 +4233,77 @@
         </w:tc>
         <w:tc>
           <w:tcPr>
-            <w:tcW w:type="dxa" w:w="2992"/>
-            <w:vAlign w:val="center"/>
-            <w:shd w:fill="EEF4F8"/>
-          </w:tcPr>
-          <w:p>
-            <w:pPr>
-              <w:spacing w:after="0"/>
-            </w:pPr>
-            <w:r>
-              <w:rPr>
-                <w:rFonts w:ascii="Aptos" w:hAnsi="Aptos"/>
-                <w:sz w:val="16"/>
-              </w:rPr>
-              <w:t>["scoring_version_mismatch","denominator_mismatch"]</w:t>
+            <w:tcW w:type="dxa" w:w="1870"/>
+            <w:vAlign w:val="center"/>
+            <w:shd w:fill="EEF4F8"/>
+          </w:tcPr>
+          <w:p>
+            <w:pPr>
+              <w:spacing w:after="0"/>
+            </w:pPr>
+            <w:r>
+              <w:rPr>
+                <w:rFonts w:ascii="Aptos" w:hAnsi="Aptos"/>
+                <w:sz w:val="16"/>
+              </w:rPr>
+              <w:t>0</w:t>
+            </w:r>
+          </w:p>
+        </w:tc>
+        <w:tc>
+          <w:tcPr>
+            <w:tcW w:type="dxa" w:w="1870"/>
+            <w:vAlign w:val="center"/>
+            <w:shd w:fill="EEF4F8"/>
+          </w:tcPr>
+          <w:p>
+            <w:pPr>
+              <w:spacing w:after="0"/>
+            </w:pPr>
+            <w:r>
+              <w:rPr>
+                <w:rFonts w:ascii="Aptos" w:hAnsi="Aptos"/>
+                <w:sz w:val="16"/>
+              </w:rPr>
+              <w:t>19</w:t>
+            </w:r>
+          </w:p>
+        </w:tc>
+        <w:tc>
+          <w:tcPr>
+            <w:tcW w:type="dxa" w:w="1870"/>
+            <w:vAlign w:val="center"/>
+            <w:shd w:fill="EEF4F8"/>
+          </w:tcPr>
+          <w:p>
+            <w:pPr>
+              <w:spacing w:after="0"/>
+            </w:pPr>
+            <w:r>
+              <w:rPr>
+                <w:rFonts w:ascii="Aptos" w:hAnsi="Aptos"/>
+                <w:sz w:val="16"/>
+              </w:rPr>
+              <w:t>13</w:t>
+            </w:r>
+          </w:p>
+        </w:tc>
+        <w:tc>
+          <w:tcPr>
+            <w:tcW w:type="dxa" w:w="1870"/>
+            <w:vAlign w:val="center"/>
+            <w:shd w:fill="EEF4F8"/>
+          </w:tcPr>
+          <w:p>
+            <w:pPr>
+              <w:spacing w:after="0"/>
+            </w:pPr>
+            <w:r>
+              <w:rPr>
+                <w:rFonts w:ascii="Aptos" w:hAnsi="Aptos"/>
+                <w:sz w:val="16"/>
+              </w:rPr>
+              <w:t>no_matched_case_ids; +3 more (see catalog CSV)</w:t>
             </w:r>
           </w:p>
         </w:tc>
@@ -3471,7 +4314,7 @@
         </w:trPr>
         <w:tc>
           <w:tcPr>
-            <w:tcW w:type="dxa" w:w="2992"/>
+            <w:tcW w:type="dxa" w:w="1870"/>
             <w:vAlign w:val="center"/>
           </w:tcPr>
           <w:p>
@@ -3489,7 +4332,7 @@
         </w:tc>
         <w:tc>
           <w:tcPr>
-            <w:tcW w:type="dxa" w:w="2992"/>
+            <w:tcW w:type="dxa" w:w="1870"/>
             <w:vAlign w:val="center"/>
           </w:tcPr>
           <w:p>
@@ -3507,7 +4350,7 @@
         </w:tc>
         <w:tc>
           <w:tcPr>
-            <w:tcW w:type="dxa" w:w="2992"/>
+            <w:tcW w:type="dxa" w:w="1870"/>
             <w:vAlign w:val="center"/>
           </w:tcPr>
           <w:p>
@@ -3525,7 +4368,7 @@
         </w:tc>
         <w:tc>
           <w:tcPr>
-            <w:tcW w:type="dxa" w:w="2992"/>
+            <w:tcW w:type="dxa" w:w="1870"/>
             <w:vAlign w:val="center"/>
           </w:tcPr>
           <w:p>
@@ -3543,19 +4386,73 @@
         </w:tc>
         <w:tc>
           <w:tcPr>
-            <w:tcW w:type="dxa" w:w="2992"/>
-            <w:vAlign w:val="center"/>
-          </w:tcPr>
-          <w:p>
-            <w:pPr>
-              <w:spacing w:after="0"/>
-            </w:pPr>
-            <w:r>
-              <w:rPr>
-                <w:rFonts w:ascii="Aptos" w:hAnsi="Aptos"/>
-                <w:sz w:val="16"/>
-              </w:rPr>
-              <w:t>["all_required_dimensions_match"]</w:t>
+            <w:tcW w:type="dxa" w:w="1870"/>
+            <w:vAlign w:val="center"/>
+          </w:tcPr>
+          <w:p>
+            <w:pPr>
+              <w:spacing w:after="0"/>
+            </w:pPr>
+            <w:r>
+              <w:rPr>
+                <w:rFonts w:ascii="Aptos" w:hAnsi="Aptos"/>
+                <w:sz w:val="16"/>
+              </w:rPr>
+              <w:t>15</w:t>
+            </w:r>
+          </w:p>
+        </w:tc>
+        <w:tc>
+          <w:tcPr>
+            <w:tcW w:type="dxa" w:w="1870"/>
+            <w:vAlign w:val="center"/>
+          </w:tcPr>
+          <w:p>
+            <w:pPr>
+              <w:spacing w:after="0"/>
+            </w:pPr>
+            <w:r>
+              <w:rPr>
+                <w:rFonts w:ascii="Aptos" w:hAnsi="Aptos"/>
+                <w:sz w:val="16"/>
+              </w:rPr>
+              <w:t>12</w:t>
+            </w:r>
+          </w:p>
+        </w:tc>
+        <w:tc>
+          <w:tcPr>
+            <w:tcW w:type="dxa" w:w="1870"/>
+            <w:vAlign w:val="center"/>
+          </w:tcPr>
+          <w:p>
+            <w:pPr>
+              <w:spacing w:after="0"/>
+            </w:pPr>
+            <w:r>
+              <w:rPr>
+                <w:rFonts w:ascii="Aptos" w:hAnsi="Aptos"/>
+                <w:sz w:val="16"/>
+              </w:rPr>
+              <w:t>0</w:t>
+            </w:r>
+          </w:p>
+        </w:tc>
+        <w:tc>
+          <w:tcPr>
+            <w:tcW w:type="dxa" w:w="1870"/>
+            <w:vAlign w:val="center"/>
+          </w:tcPr>
+          <w:p>
+            <w:pPr>
+              <w:spacing w:after="0"/>
+            </w:pPr>
+            <w:r>
+              <w:rPr>
+                <w:rFonts w:ascii="Aptos" w:hAnsi="Aptos"/>
+                <w:sz w:val="16"/>
+              </w:rPr>
+              <w:t>all_required_dimensions_match</w:t>
             </w:r>
           </w:p>
         </w:tc>
@@ -3566,7 +4463,7 @@
         </w:trPr>
         <w:tc>
           <w:tcPr>
-            <w:tcW w:type="dxa" w:w="2992"/>
+            <w:tcW w:type="dxa" w:w="1870"/>
             <w:vAlign w:val="center"/>
             <w:shd w:fill="EEF4F8"/>
           </w:tcPr>
@@ -3585,7 +4482,7 @@
         </w:tc>
         <w:tc>
           <w:tcPr>
-            <w:tcW w:type="dxa" w:w="2992"/>
+            <w:tcW w:type="dxa" w:w="1870"/>
             <w:vAlign w:val="center"/>
             <w:shd w:fill="EEF4F8"/>
           </w:tcPr>
@@ -3604,7 +4501,7 @@
         </w:tc>
         <w:tc>
           <w:tcPr>
-            <w:tcW w:type="dxa" w:w="2992"/>
+            <w:tcW w:type="dxa" w:w="1870"/>
             <w:vAlign w:val="center"/>
             <w:shd w:fill="EEF4F8"/>
           </w:tcPr>
@@ -3623,7 +4520,7 @@
         </w:tc>
         <w:tc>
           <w:tcPr>
-            <w:tcW w:type="dxa" w:w="2992"/>
+            <w:tcW w:type="dxa" w:w="1870"/>
             <w:vAlign w:val="center"/>
             <w:shd w:fill="EEF4F8"/>
           </w:tcPr>
@@ -3642,20 +4539,77 @@
         </w:tc>
         <w:tc>
           <w:tcPr>
-            <w:tcW w:type="dxa" w:w="2992"/>
-            <w:vAlign w:val="center"/>
-            <w:shd w:fill="EEF4F8"/>
-          </w:tcPr>
-          <w:p>
-            <w:pPr>
-              <w:spacing w:after="0"/>
-            </w:pPr>
-            <w:r>
-              <w:rPr>
-                <w:rFonts w:ascii="Aptos" w:hAnsi="Aptos"/>
-                <w:sz w:val="16"/>
-              </w:rPr>
-              <w:t>["all_required_dimensions_match"]</w:t>
+            <w:tcW w:type="dxa" w:w="1870"/>
+            <w:vAlign w:val="center"/>
+            <w:shd w:fill="EEF4F8"/>
+          </w:tcPr>
+          <w:p>
+            <w:pPr>
+              <w:spacing w:after="0"/>
+            </w:pPr>
+            <w:r>
+              <w:rPr>
+                <w:rFonts w:ascii="Aptos" w:hAnsi="Aptos"/>
+                <w:sz w:val="16"/>
+              </w:rPr>
+              <w:t>15</w:t>
+            </w:r>
+          </w:p>
+        </w:tc>
+        <w:tc>
+          <w:tcPr>
+            <w:tcW w:type="dxa" w:w="1870"/>
+            <w:vAlign w:val="center"/>
+            <w:shd w:fill="EEF4F8"/>
+          </w:tcPr>
+          <w:p>
+            <w:pPr>
+              <w:spacing w:after="0"/>
+            </w:pPr>
+            <w:r>
+              <w:rPr>
+                <w:rFonts w:ascii="Aptos" w:hAnsi="Aptos"/>
+                <w:sz w:val="16"/>
+              </w:rPr>
+              <w:t>12</w:t>
+            </w:r>
+          </w:p>
+        </w:tc>
+        <w:tc>
+          <w:tcPr>
+            <w:tcW w:type="dxa" w:w="1870"/>
+            <w:vAlign w:val="center"/>
+            <w:shd w:fill="EEF4F8"/>
+          </w:tcPr>
+          <w:p>
+            <w:pPr>
+              <w:spacing w:after="0"/>
+            </w:pPr>
+            <w:r>
+              <w:rPr>
+                <w:rFonts w:ascii="Aptos" w:hAnsi="Aptos"/>
+                <w:sz w:val="16"/>
+              </w:rPr>
+              <w:t>0</w:t>
+            </w:r>
+          </w:p>
+        </w:tc>
+        <w:tc>
+          <w:tcPr>
+            <w:tcW w:type="dxa" w:w="1870"/>
+            <w:vAlign w:val="center"/>
+            <w:shd w:fill="EEF4F8"/>
+          </w:tcPr>
+          <w:p>
+            <w:pPr>
+              <w:spacing w:after="0"/>
+            </w:pPr>
+            <w:r>
+              <w:rPr>
+                <w:rFonts w:ascii="Aptos" w:hAnsi="Aptos"/>
+                <w:sz w:val="16"/>
+              </w:rPr>
+              <w:t>all_required_dimensions_match</w:t>
             </w:r>
           </w:p>
         </w:tc>
@@ -3666,7 +4620,7 @@
         </w:trPr>
         <w:tc>
           <w:tcPr>
-            <w:tcW w:type="dxa" w:w="2992"/>
+            <w:tcW w:type="dxa" w:w="1870"/>
             <w:vAlign w:val="center"/>
           </w:tcPr>
           <w:p>
@@ -3684,7 +4638,7 @@
         </w:tc>
         <w:tc>
           <w:tcPr>
-            <w:tcW w:type="dxa" w:w="2992"/>
+            <w:tcW w:type="dxa" w:w="1870"/>
             <w:vAlign w:val="center"/>
           </w:tcPr>
           <w:p>
@@ -3702,7 +4656,7 @@
         </w:tc>
         <w:tc>
           <w:tcPr>
-            <w:tcW w:type="dxa" w:w="2992"/>
+            <w:tcW w:type="dxa" w:w="1870"/>
             <w:vAlign w:val="center"/>
           </w:tcPr>
           <w:p>
@@ -3720,7 +4674,7 @@
         </w:tc>
         <w:tc>
           <w:tcPr>
-            <w:tcW w:type="dxa" w:w="2992"/>
+            <w:tcW w:type="dxa" w:w="1870"/>
             <w:vAlign w:val="center"/>
           </w:tcPr>
           <w:p>
@@ -3738,19 +4692,73 @@
         </w:tc>
         <w:tc>
           <w:tcPr>
-            <w:tcW w:type="dxa" w:w="2992"/>
-            <w:vAlign w:val="center"/>
-          </w:tcPr>
-          <w:p>
-            <w:pPr>
-              <w:spacing w:after="0"/>
-            </w:pPr>
-            <w:r>
-              <w:rPr>
-                <w:rFonts w:ascii="Aptos" w:hAnsi="Aptos"/>
-                <w:sz w:val="16"/>
-              </w:rPr>
-              <w:t>["model_mismatch","input_length_mismatch","output_length_mismatch","backend_class_mismatch","repetition_treatment_mismatch","input_length_missing","output_length_missing"]</w:t>
+            <w:tcW w:type="dxa" w:w="1870"/>
+            <w:vAlign w:val="center"/>
+          </w:tcPr>
+          <w:p>
+            <w:pPr>
+              <w:spacing w:after="0"/>
+            </w:pPr>
+            <w:r>
+              <w:rPr>
+                <w:rFonts w:ascii="Aptos" w:hAnsi="Aptos"/>
+                <w:sz w:val="16"/>
+              </w:rPr>
+              <w:t>0</w:t>
+            </w:r>
+          </w:p>
+        </w:tc>
+        <w:tc>
+          <w:tcPr>
+            <w:tcW w:type="dxa" w:w="1870"/>
+            <w:vAlign w:val="center"/>
+          </w:tcPr>
+          <w:p>
+            <w:pPr>
+              <w:spacing w:after="0"/>
+            </w:pPr>
+            <w:r>
+              <w:rPr>
+                <w:rFonts w:ascii="Aptos" w:hAnsi="Aptos"/>
+                <w:sz w:val="16"/>
+              </w:rPr>
+              <w:t>27</w:t>
+            </w:r>
+          </w:p>
+        </w:tc>
+        <w:tc>
+          <w:tcPr>
+            <w:tcW w:type="dxa" w:w="1870"/>
+            <w:vAlign w:val="center"/>
+          </w:tcPr>
+          <w:p>
+            <w:pPr>
+              <w:spacing w:after="0"/>
+            </w:pPr>
+            <w:r>
+              <w:rPr>
+                <w:rFonts w:ascii="Aptos" w:hAnsi="Aptos"/>
+                <w:sz w:val="16"/>
+              </w:rPr>
+              <w:t>13</w:t>
+            </w:r>
+          </w:p>
+        </w:tc>
+        <w:tc>
+          <w:tcPr>
+            <w:tcW w:type="dxa" w:w="1870"/>
+            <w:vAlign w:val="center"/>
+          </w:tcPr>
+          <w:p>
+            <w:pPr>
+              <w:spacing w:after="0"/>
+            </w:pPr>
+            <w:r>
+              <w:rPr>
+                <w:rFonts w:ascii="Aptos" w:hAnsi="Aptos"/>
+                <w:sz w:val="16"/>
+              </w:rPr>
+              <w:t>no_matched_case_ids</w:t>
             </w:r>
           </w:p>
         </w:tc>
@@ -3761,7 +4769,7 @@
         </w:trPr>
         <w:tc>
           <w:tcPr>
-            <w:tcW w:type="dxa" w:w="2992"/>
+            <w:tcW w:type="dxa" w:w="1870"/>
             <w:vAlign w:val="center"/>
             <w:shd w:fill="EEF4F8"/>
           </w:tcPr>
@@ -3780,7 +4788,7 @@
         </w:tc>
         <w:tc>
           <w:tcPr>
-            <w:tcW w:type="dxa" w:w="2992"/>
+            <w:tcW w:type="dxa" w:w="1870"/>
             <w:vAlign w:val="center"/>
             <w:shd w:fill="EEF4F8"/>
           </w:tcPr>
@@ -3799,7 +4807,7 @@
         </w:tc>
         <w:tc>
           <w:tcPr>
-            <w:tcW w:type="dxa" w:w="2992"/>
+            <w:tcW w:type="dxa" w:w="1870"/>
             <w:vAlign w:val="center"/>
             <w:shd w:fill="EEF4F8"/>
           </w:tcPr>
@@ -3818,7 +4826,7 @@
         </w:tc>
         <w:tc>
           <w:tcPr>
-            <w:tcW w:type="dxa" w:w="2992"/>
+            <w:tcW w:type="dxa" w:w="1870"/>
             <w:vAlign w:val="center"/>
             <w:shd w:fill="EEF4F8"/>
           </w:tcPr>
@@ -3837,20 +4845,77 @@
         </w:tc>
         <w:tc>
           <w:tcPr>
-            <w:tcW w:type="dxa" w:w="2992"/>
-            <w:vAlign w:val="center"/>
-            <w:shd w:fill="EEF4F8"/>
-          </w:tcPr>
-          <w:p>
-            <w:pPr>
-              <w:spacing w:after="0"/>
-            </w:pPr>
-            <w:r>
-              <w:rPr>
-                <w:rFonts w:ascii="Aptos" w:hAnsi="Aptos"/>
-                <w:sz w:val="16"/>
-              </w:rPr>
-              <w:t>["model_mismatch","backend_class_mismatch","prompt_set_mismatch","rubric_mismatch","scoring_version_mismatch","denominator_mismatch","aggregation_mismatch"]</w:t>
+            <w:tcW w:type="dxa" w:w="1870"/>
+            <w:vAlign w:val="center"/>
+            <w:shd w:fill="EEF4F8"/>
+          </w:tcPr>
+          <w:p>
+            <w:pPr>
+              <w:spacing w:after="0"/>
+            </w:pPr>
+            <w:r>
+              <w:rPr>
+                <w:rFonts w:ascii="Aptos" w:hAnsi="Aptos"/>
+                <w:sz w:val="16"/>
+              </w:rPr>
+              <w:t>0</w:t>
+            </w:r>
+          </w:p>
+        </w:tc>
+        <w:tc>
+          <w:tcPr>
+            <w:tcW w:type="dxa" w:w="1870"/>
+            <w:vAlign w:val="center"/>
+            <w:shd w:fill="EEF4F8"/>
+          </w:tcPr>
+          <w:p>
+            <w:pPr>
+              <w:spacing w:after="0"/>
+            </w:pPr>
+            <w:r>
+              <w:rPr>
+                <w:rFonts w:ascii="Aptos" w:hAnsi="Aptos"/>
+                <w:sz w:val="16"/>
+              </w:rPr>
+              <w:t>27</w:t>
+            </w:r>
+          </w:p>
+        </w:tc>
+        <w:tc>
+          <w:tcPr>
+            <w:tcW w:type="dxa" w:w="1870"/>
+            <w:vAlign w:val="center"/>
+            <w:shd w:fill="EEF4F8"/>
+          </w:tcPr>
+          <w:p>
+            <w:pPr>
+              <w:spacing w:after="0"/>
+            </w:pPr>
+            <w:r>
+              <w:rPr>
+                <w:rFonts w:ascii="Aptos" w:hAnsi="Aptos"/>
+                <w:sz w:val="16"/>
+              </w:rPr>
+              <w:t>13</w:t>
+            </w:r>
+          </w:p>
+        </w:tc>
+        <w:tc>
+          <w:tcPr>
+            <w:tcW w:type="dxa" w:w="1870"/>
+            <w:vAlign w:val="center"/>
+            <w:shd w:fill="EEF4F8"/>
+          </w:tcPr>
+          <w:p>
+            <w:pPr>
+              <w:spacing w:after="0"/>
+            </w:pPr>
+            <w:r>
+              <w:rPr>
+                <w:rFonts w:ascii="Aptos" w:hAnsi="Aptos"/>
+                <w:sz w:val="16"/>
+              </w:rPr>
+              <w:t>no_matched_case_ids; +8 more (see catalog CSV)</w:t>
             </w:r>
           </w:p>
         </w:tc>
@@ -3861,7 +4926,7 @@
         </w:trPr>
         <w:tc>
           <w:tcPr>
-            <w:tcW w:type="dxa" w:w="2992"/>
+            <w:tcW w:type="dxa" w:w="1870"/>
             <w:vAlign w:val="center"/>
           </w:tcPr>
           <w:p>
@@ -3879,7 +4944,7 @@
         </w:tc>
         <w:tc>
           <w:tcPr>
-            <w:tcW w:type="dxa" w:w="2992"/>
+            <w:tcW w:type="dxa" w:w="1870"/>
             <w:vAlign w:val="center"/>
           </w:tcPr>
           <w:p>
@@ -3897,7 +4962,7 @@
         </w:tc>
         <w:tc>
           <w:tcPr>
-            <w:tcW w:type="dxa" w:w="2992"/>
+            <w:tcW w:type="dxa" w:w="1870"/>
             <w:vAlign w:val="center"/>
           </w:tcPr>
           <w:p>
@@ -3915,7 +4980,7 @@
         </w:tc>
         <w:tc>
           <w:tcPr>
-            <w:tcW w:type="dxa" w:w="2992"/>
+            <w:tcW w:type="dxa" w:w="1870"/>
             <w:vAlign w:val="center"/>
           </w:tcPr>
           <w:p>
@@ -3933,19 +4998,73 @@
         </w:tc>
         <w:tc>
           <w:tcPr>
-            <w:tcW w:type="dxa" w:w="2992"/>
-            <w:vAlign w:val="center"/>
-          </w:tcPr>
-          <w:p>
-            <w:pPr>
-              <w:spacing w:after="0"/>
-            </w:pPr>
-            <w:r>
-              <w:rPr>
-                <w:rFonts w:ascii="Aptos" w:hAnsi="Aptos"/>
-                <w:sz w:val="16"/>
-              </w:rPr>
-              <w:t>["model_mismatch","input_length_mismatch","output_length_mismatch","backend_class_mismatch","repetition_treatment_mismatch","input_length_missing","output_length_missing"]</w:t>
+            <w:tcW w:type="dxa" w:w="1870"/>
+            <w:vAlign w:val="center"/>
+          </w:tcPr>
+          <w:p>
+            <w:pPr>
+              <w:spacing w:after="0"/>
+            </w:pPr>
+            <w:r>
+              <w:rPr>
+                <w:rFonts w:ascii="Aptos" w:hAnsi="Aptos"/>
+                <w:sz w:val="16"/>
+              </w:rPr>
+              <w:t>0</w:t>
+            </w:r>
+          </w:p>
+        </w:tc>
+        <w:tc>
+          <w:tcPr>
+            <w:tcW w:type="dxa" w:w="1870"/>
+            <w:vAlign w:val="center"/>
+          </w:tcPr>
+          <w:p>
+            <w:pPr>
+              <w:spacing w:after="0"/>
+            </w:pPr>
+            <w:r>
+              <w:rPr>
+                <w:rFonts w:ascii="Aptos" w:hAnsi="Aptos"/>
+                <w:sz w:val="16"/>
+              </w:rPr>
+              <w:t>15</w:t>
+            </w:r>
+          </w:p>
+        </w:tc>
+        <w:tc>
+          <w:tcPr>
+            <w:tcW w:type="dxa" w:w="1870"/>
+            <w:vAlign w:val="center"/>
+          </w:tcPr>
+          <w:p>
+            <w:pPr>
+              <w:spacing w:after="0"/>
+            </w:pPr>
+            <w:r>
+              <w:rPr>
+                <w:rFonts w:ascii="Aptos" w:hAnsi="Aptos"/>
+                <w:sz w:val="16"/>
+              </w:rPr>
+              <w:t>13</w:t>
+            </w:r>
+          </w:p>
+        </w:tc>
+        <w:tc>
+          <w:tcPr>
+            <w:tcW w:type="dxa" w:w="1870"/>
+            <w:vAlign w:val="center"/>
+          </w:tcPr>
+          <w:p>
+            <w:pPr>
+              <w:spacing w:after="0"/>
+            </w:pPr>
+            <w:r>
+              <w:rPr>
+                <w:rFonts w:ascii="Aptos" w:hAnsi="Aptos"/>
+                <w:sz w:val="16"/>
+              </w:rPr>
+              <w:t>no_matched_case_ids</w:t>
             </w:r>
           </w:p>
         </w:tc>
@@ -3956,7 +5075,7 @@
         </w:trPr>
         <w:tc>
           <w:tcPr>
-            <w:tcW w:type="dxa" w:w="2992"/>
+            <w:tcW w:type="dxa" w:w="1870"/>
             <w:vAlign w:val="center"/>
             <w:shd w:fill="EEF4F8"/>
           </w:tcPr>
@@ -3975,7 +5094,7 @@
         </w:tc>
         <w:tc>
           <w:tcPr>
-            <w:tcW w:type="dxa" w:w="2992"/>
+            <w:tcW w:type="dxa" w:w="1870"/>
             <w:vAlign w:val="center"/>
             <w:shd w:fill="EEF4F8"/>
           </w:tcPr>
@@ -3994,7 +5113,7 @@
         </w:tc>
         <w:tc>
           <w:tcPr>
-            <w:tcW w:type="dxa" w:w="2992"/>
+            <w:tcW w:type="dxa" w:w="1870"/>
             <w:vAlign w:val="center"/>
             <w:shd w:fill="EEF4F8"/>
           </w:tcPr>
@@ -4013,7 +5132,7 @@
         </w:tc>
         <w:tc>
           <w:tcPr>
-            <w:tcW w:type="dxa" w:w="2992"/>
+            <w:tcW w:type="dxa" w:w="1870"/>
             <w:vAlign w:val="center"/>
             <w:shd w:fill="EEF4F8"/>
           </w:tcPr>
@@ -4032,20 +5151,77 @@
         </w:tc>
         <w:tc>
           <w:tcPr>
-            <w:tcW w:type="dxa" w:w="2992"/>
-            <w:vAlign w:val="center"/>
-            <w:shd w:fill="EEF4F8"/>
-          </w:tcPr>
-          <w:p>
-            <w:pPr>
-              <w:spacing w:after="0"/>
-            </w:pPr>
-            <w:r>
-              <w:rPr>
-                <w:rFonts w:ascii="Aptos" w:hAnsi="Aptos"/>
-                <w:sz w:val="16"/>
-              </w:rPr>
-              <w:t>["model_mismatch","backend_class_mismatch","prompt_set_mismatch","rubric_mismatch","scoring_version_mismatch","denominator_mismatch","aggregation_mismatch"]</w:t>
+            <w:tcW w:type="dxa" w:w="1870"/>
+            <w:vAlign w:val="center"/>
+            <w:shd w:fill="EEF4F8"/>
+          </w:tcPr>
+          <w:p>
+            <w:pPr>
+              <w:spacing w:after="0"/>
+            </w:pPr>
+            <w:r>
+              <w:rPr>
+                <w:rFonts w:ascii="Aptos" w:hAnsi="Aptos"/>
+                <w:sz w:val="16"/>
+              </w:rPr>
+              <w:t>0</w:t>
+            </w:r>
+          </w:p>
+        </w:tc>
+        <w:tc>
+          <w:tcPr>
+            <w:tcW w:type="dxa" w:w="1870"/>
+            <w:vAlign w:val="center"/>
+            <w:shd w:fill="EEF4F8"/>
+          </w:tcPr>
+          <w:p>
+            <w:pPr>
+              <w:spacing w:after="0"/>
+            </w:pPr>
+            <w:r>
+              <w:rPr>
+                <w:rFonts w:ascii="Aptos" w:hAnsi="Aptos"/>
+                <w:sz w:val="16"/>
+              </w:rPr>
+              <w:t>15</w:t>
+            </w:r>
+          </w:p>
+        </w:tc>
+        <w:tc>
+          <w:tcPr>
+            <w:tcW w:type="dxa" w:w="1870"/>
+            <w:vAlign w:val="center"/>
+            <w:shd w:fill="EEF4F8"/>
+          </w:tcPr>
+          <w:p>
+            <w:pPr>
+              <w:spacing w:after="0"/>
+            </w:pPr>
+            <w:r>
+              <w:rPr>
+                <w:rFonts w:ascii="Aptos" w:hAnsi="Aptos"/>
+                <w:sz w:val="16"/>
+              </w:rPr>
+              <w:t>13</w:t>
+            </w:r>
+          </w:p>
+        </w:tc>
+        <w:tc>
+          <w:tcPr>
+            <w:tcW w:type="dxa" w:w="1870"/>
+            <w:vAlign w:val="center"/>
+            <w:shd w:fill="EEF4F8"/>
+          </w:tcPr>
+          <w:p>
+            <w:pPr>
+              <w:spacing w:after="0"/>
+            </w:pPr>
+            <w:r>
+              <w:rPr>
+                <w:rFonts w:ascii="Aptos" w:hAnsi="Aptos"/>
+                <w:sz w:val="16"/>
+              </w:rPr>
+              <w:t>no_matched_case_ids; +8 more (see catalog CSV)</w:t>
             </w:r>
           </w:p>
         </w:tc>
@@ -4058,6 +5234,15 @@
       </w:pPr>
       <w:r>
         <w:t>Direct still requires consumers to match individual model/configuration rows.</w:t>
+      </w:r>
+    </w:p>
+    <w:p>
+      <w:pPr>
+        <w:pStyle w:val="Caption"/>
+        <w:spacing w:after="60"/>
+      </w:pPr>
+      <w:r>
+        <w:t>Complete machine-readable reason codes, details, case IDs, and signature mismatches are retained in the comparability catalog CSV.</w:t>
       </w:r>
     </w:p>
     <w:p>
@@ -28189,7 +29374,7 @@
                 <w:rFonts w:ascii="Aptos" w:hAnsi="Aptos"/>
                 <w:sz w:val="16"/>
               </w:rPr>
-              <w:t>["model_mismatch","input_length_mismatch","output_length_mismatch","repetition_treatment_mismatch","input_length_missing","output_length_missing"]</w:t>
+              <w:t>["no_matched_case_ids"]</w:t>
             </w:r>
           </w:p>
         </w:tc>
@@ -28270,7 +29455,7 @@
                 <w:rFonts w:ascii="Aptos" w:hAnsi="Aptos"/>
                 <w:sz w:val="16"/>
               </w:rPr>
-              <w:t>["model_mismatch","input_length_mismatch","output_length_mismatch","backend_class_mismatch","repetition_treatment_mismatch"]</w:t>
+              <w:t>["no_matched_case_ids"]</w:t>
             </w:r>
           </w:p>
         </w:tc>
@@ -28347,7 +29532,7 @@
                 <w:rFonts w:ascii="Aptos" w:hAnsi="Aptos"/>
                 <w:sz w:val="16"/>
               </w:rPr>
-              <w:t>["model_mismatch","input_length_mismatch","output_length_mismatch","backend_class_mismatch","repetition_treatment_mismatch"]</w:t>
+              <w:t>["no_matched_case_ids"]</w:t>
             </w:r>
           </w:p>
         </w:tc>
@@ -28428,7 +29613,7 @@
                 <w:rFonts w:ascii="Aptos" w:hAnsi="Aptos"/>
                 <w:sz w:val="16"/>
               </w:rPr>
-              <w:t>["model_mismatch","input_length_mismatch","output_length_mismatch","repetition_treatment_mismatch","input_length_missing","output_length_missing"]</w:t>
+              <w:t>["no_matched_case_ids"]</w:t>
             </w:r>
           </w:p>
         </w:tc>
@@ -28505,7 +29690,7 @@
                 <w:rFonts w:ascii="Aptos" w:hAnsi="Aptos"/>
                 <w:sz w:val="16"/>
               </w:rPr>
-              <w:t>["model_mismatch","input_length_mismatch","output_length_mismatch","backend_class_mismatch","repetition_treatment_mismatch","input_length_missing","output_length_missing"]</w:t>
+              <w:t>["no_matched_case_ids"]</w:t>
             </w:r>
           </w:p>
         </w:tc>
@@ -28586,7 +29771,7 @@
                 <w:rFonts w:ascii="Aptos" w:hAnsi="Aptos"/>
                 <w:sz w:val="16"/>
               </w:rPr>
-              <w:t>["model_mismatch","input_length_mismatch","output_length_mismatch","backend_class_mismatch","repetition_treatment_mismatch","input_length_missing","output_length_missing"]</w:t>
+              <w:t>["no_matched_case_ids"]</w:t>
             </w:r>
           </w:p>
         </w:tc>
@@ -28663,7 +29848,7 @@
                 <w:rFonts w:ascii="Aptos" w:hAnsi="Aptos"/>
                 <w:sz w:val="16"/>
               </w:rPr>
-              <w:t>["repetition_treatment_mismatch","input_length_missing","output_length_missing"]</w:t>
+              <w:t>["no_matched_case_ids"]</w:t>
             </w:r>
           </w:p>
         </w:tc>
@@ -28821,7 +30006,7 @@
                 <w:rFonts w:ascii="Aptos" w:hAnsi="Aptos"/>
                 <w:sz w:val="16"/>
               </w:rPr>
-              <w:t>["model_mismatch","input_length_mismatch","output_length_mismatch","backend_class_mismatch","repetition_treatment_mismatch","input_length_missing","output_length_missing"]</w:t>
+              <w:t>["no_matched_case_ids"]</w:t>
             </w:r>
           </w:p>
         </w:tc>
@@ -28902,7 +30087,7 @@
                 <w:rFonts w:ascii="Aptos" w:hAnsi="Aptos"/>
                 <w:sz w:val="16"/>
               </w:rPr>
-              <w:t>["model_mismatch","input_length_mismatch","output_length_mismatch","backend_class_mismatch","repetition_treatment_mismatch","input_length_missing","output_length_missing"]</w:t>
+              <w:t>["no_matched_case_ids"]</w:t>
             </w:r>
           </w:p>
         </w:tc>
@@ -28921,7 +30106,7 @@
     </w:p>
     <w:p>
       <w:r>
-        <w:t>Quality ranking additionally requires the identical prompt set, rubric, scoring version, denominator, and aggregation.</w:t>
+        <w:t>Quality ranking additionally requires the identical prompt set, prompt-suite identity, rubric, scoring version, denominator, and aggregation.</w:t>
       </w:r>
     </w:p>
     <w:p>
@@ -28943,11 +30128,12 @@
         <w:tblLook w:firstColumn="1" w:firstRow="1" w:lastColumn="0" w:lastRow="0" w:noHBand="0" w:noVBand="1" w:val="04A0"/>
       </w:tblPr>
       <w:tblGrid>
-        <w:gridCol w:w="2992"/>
-        <w:gridCol w:w="2992"/>
-        <w:gridCol w:w="2992"/>
-        <w:gridCol w:w="2992"/>
-        <w:gridCol w:w="2992"/>
+        <w:gridCol w:w="2494"/>
+        <w:gridCol w:w="2494"/>
+        <w:gridCol w:w="2494"/>
+        <w:gridCol w:w="2494"/>
+        <w:gridCol w:w="2494"/>
+        <w:gridCol w:w="2494"/>
       </w:tblGrid>
       <w:tr>
         <w:trPr>
@@ -28956,7 +30142,7 @@
         </w:trPr>
         <w:tc>
           <w:tcPr>
-            <w:tcW w:type="dxa" w:w="2992"/>
+            <w:tcW w:type="dxa" w:w="2494"/>
             <w:vAlign w:val="center"/>
             <w:shd w:fill="0B63CE"/>
           </w:tcPr>
@@ -28977,7 +30163,7 @@
         </w:tc>
         <w:tc>
           <w:tcPr>
-            <w:tcW w:type="dxa" w:w="2992"/>
+            <w:tcW w:type="dxa" w:w="2494"/>
             <w:vAlign w:val="center"/>
             <w:shd w:fill="0B63CE"/>
           </w:tcPr>
@@ -28998,7 +30184,7 @@
         </w:tc>
         <w:tc>
           <w:tcPr>
-            <w:tcW w:type="dxa" w:w="2992"/>
+            <w:tcW w:type="dxa" w:w="2494"/>
             <w:vAlign w:val="center"/>
             <w:shd w:fill="0B63CE"/>
           </w:tcPr>
@@ -29013,13 +30199,13 @@
                 <w:color w:val="FFFFFF"/>
                 <w:sz w:val="16"/>
               </w:rPr>
-              <w:t>Rubric</w:t>
-            </w:r>
-          </w:p>
-        </w:tc>
-        <w:tc>
-          <w:tcPr>
-            <w:tcW w:type="dxa" w:w="2992"/>
+              <w:t>Prompt suite</w:t>
+            </w:r>
+          </w:p>
+        </w:tc>
+        <w:tc>
+          <w:tcPr>
+            <w:tcW w:type="dxa" w:w="2494"/>
             <w:vAlign w:val="center"/>
             <w:shd w:fill="0B63CE"/>
           </w:tcPr>
@@ -29034,13 +30220,34 @@
                 <w:color w:val="FFFFFF"/>
                 <w:sz w:val="16"/>
               </w:rPr>
+              <w:t>Rubric</w:t>
+            </w:r>
+          </w:p>
+        </w:tc>
+        <w:tc>
+          <w:tcPr>
+            <w:tcW w:type="dxa" w:w="2494"/>
+            <w:vAlign w:val="center"/>
+            <w:shd w:fill="0B63CE"/>
+          </w:tcPr>
+          <w:p>
+            <w:pPr>
+              <w:spacing w:after="0"/>
+            </w:pPr>
+            <w:r>
+              <w:rPr>
+                <w:rFonts w:ascii="Aptos" w:hAnsi="Aptos"/>
+                <w:b/>
+                <w:color w:val="FFFFFF"/>
+                <w:sz w:val="16"/>
+              </w:rPr>
               <w:t>Scoring version</w:t>
             </w:r>
           </w:p>
         </w:tc>
         <w:tc>
           <w:tcPr>
-            <w:tcW w:type="dxa" w:w="2992"/>
+            <w:tcW w:type="dxa" w:w="2494"/>
             <w:vAlign w:val="center"/>
             <w:shd w:fill="0B63CE"/>
           </w:tcPr>
@@ -29066,7 +30273,7 @@
         </w:trPr>
         <w:tc>
           <w:tcPr>
-            <w:tcW w:type="dxa" w:w="2992"/>
+            <w:tcW w:type="dxa" w:w="2494"/>
             <w:vAlign w:val="center"/>
           </w:tcPr>
           <w:p>
@@ -29084,7 +30291,7 @@
         </w:tc>
         <w:tc>
           <w:tcPr>
-            <w:tcW w:type="dxa" w:w="2992"/>
+            <w:tcW w:type="dxa" w:w="2494"/>
             <w:vAlign w:val="center"/>
           </w:tcPr>
           <w:p>
@@ -29102,7 +30309,25 @@
         </w:tc>
         <w:tc>
           <w:tcPr>
-            <w:tcW w:type="dxa" w:w="2992"/>
+            <w:tcW w:type="dxa" w:w="2494"/>
+            <w:vAlign w:val="center"/>
+          </w:tcPr>
+          <w:p>
+            <w:pPr>
+              <w:spacing w:after="0"/>
+            </w:pPr>
+            <w:r>
+              <w:rPr>
+                <w:rFonts w:ascii="Aptos" w:hAnsi="Aptos"/>
+                <w:sz w:val="16"/>
+              </w:rPr>
+              <w:t>GTQ-PROMPTS-v1</w:t>
+            </w:r>
+          </w:p>
+        </w:tc>
+        <w:tc>
+          <w:tcPr>
+            <w:tcW w:type="dxa" w:w="2494"/>
             <w:vAlign w:val="center"/>
           </w:tcPr>
           <w:p>
@@ -29120,7 +30345,7 @@
         </w:tc>
         <w:tc>
           <w:tcPr>
-            <w:tcW w:type="dxa" w:w="2992"/>
+            <w:tcW w:type="dxa" w:w="2494"/>
             <w:vAlign w:val="center"/>
           </w:tcPr>
           <w:p>
@@ -29138,7 +30363,7 @@
         </w:tc>
         <w:tc>
           <w:tcPr>
-            <w:tcW w:type="dxa" w:w="2992"/>
+            <w:tcW w:type="dxa" w:w="2494"/>
             <w:vAlign w:val="center"/>
           </w:tcPr>
           <w:p>
@@ -29161,7 +30386,7 @@
         </w:trPr>
         <w:tc>
           <w:tcPr>
-            <w:tcW w:type="dxa" w:w="2992"/>
+            <w:tcW w:type="dxa" w:w="2494"/>
             <w:vAlign w:val="center"/>
             <w:shd w:fill="EEF4F8"/>
           </w:tcPr>
@@ -29180,7 +30405,7 @@
         </w:tc>
         <w:tc>
           <w:tcPr>
-            <w:tcW w:type="dxa" w:w="2992"/>
+            <w:tcW w:type="dxa" w:w="2494"/>
             <w:vAlign w:val="center"/>
             <w:shd w:fill="EEF4F8"/>
           </w:tcPr>
@@ -29199,7 +30424,26 @@
         </w:tc>
         <w:tc>
           <w:tcPr>
-            <w:tcW w:type="dxa" w:w="2992"/>
+            <w:tcW w:type="dxa" w:w="2494"/>
+            <w:vAlign w:val="center"/>
+            <w:shd w:fill="EEF4F8"/>
+          </w:tcPr>
+          <w:p>
+            <w:pPr>
+              <w:spacing w:after="0"/>
+            </w:pPr>
+            <w:r>
+              <w:rPr>
+                <w:rFonts w:ascii="Aptos" w:hAnsi="Aptos"/>
+                <w:sz w:val="16"/>
+              </w:rPr>
+              <w:t>GTQ-PROMPTS-v1</w:t>
+            </w:r>
+          </w:p>
+        </w:tc>
+        <w:tc>
+          <w:tcPr>
+            <w:tcW w:type="dxa" w:w="2494"/>
             <w:vAlign w:val="center"/>
             <w:shd w:fill="EEF4F8"/>
           </w:tcPr>
@@ -29218,7 +30462,7 @@
         </w:tc>
         <w:tc>
           <w:tcPr>
-            <w:tcW w:type="dxa" w:w="2992"/>
+            <w:tcW w:type="dxa" w:w="2494"/>
             <w:vAlign w:val="center"/>
             <w:shd w:fill="EEF4F8"/>
           </w:tcPr>
@@ -29237,7 +30481,7 @@
         </w:tc>
         <w:tc>
           <w:tcPr>
-            <w:tcW w:type="dxa" w:w="2992"/>
+            <w:tcW w:type="dxa" w:w="2494"/>
             <w:vAlign w:val="center"/>
             <w:shd w:fill="EEF4F8"/>
           </w:tcPr>
@@ -29261,7 +30505,7 @@
         </w:trPr>
         <w:tc>
           <w:tcPr>
-            <w:tcW w:type="dxa" w:w="2992"/>
+            <w:tcW w:type="dxa" w:w="2494"/>
             <w:vAlign w:val="center"/>
           </w:tcPr>
           <w:p>
@@ -29279,7 +30523,7 @@
         </w:tc>
         <w:tc>
           <w:tcPr>
-            <w:tcW w:type="dxa" w:w="2992"/>
+            <w:tcW w:type="dxa" w:w="2494"/>
             <w:vAlign w:val="center"/>
           </w:tcPr>
           <w:p>
@@ -29297,7 +30541,25 @@
         </w:tc>
         <w:tc>
           <w:tcPr>
-            <w:tcW w:type="dxa" w:w="2992"/>
+            <w:tcW w:type="dxa" w:w="2494"/>
+            <w:vAlign w:val="center"/>
+          </w:tcPr>
+          <w:p>
+            <w:pPr>
+              <w:spacing w:after="0"/>
+            </w:pPr>
+            <w:r>
+              <w:rPr>
+                <w:rFonts w:ascii="Aptos" w:hAnsi="Aptos"/>
+                <w:sz w:val="16"/>
+              </w:rPr>
+              <w:t>OPENVINO-SECTOR-EXPERIENCE-QUALITY-v3</w:t>
+            </w:r>
+          </w:p>
+        </w:tc>
+        <w:tc>
+          <w:tcPr>
+            <w:tcW w:type="dxa" w:w="2494"/>
             <w:vAlign w:val="center"/>
           </w:tcPr>
           <w:p>
@@ -29315,7 +30577,7 @@
         </w:tc>
         <w:tc>
           <w:tcPr>
-            <w:tcW w:type="dxa" w:w="2992"/>
+            <w:tcW w:type="dxa" w:w="2494"/>
             <w:vAlign w:val="center"/>
           </w:tcPr>
           <w:p>
@@ -29333,7 +30595,7 @@
         </w:tc>
         <w:tc>
           <w:tcPr>
-            <w:tcW w:type="dxa" w:w="2992"/>
+            <w:tcW w:type="dxa" w:w="2494"/>
             <w:vAlign w:val="center"/>
           </w:tcPr>
           <w:p>
@@ -29356,7 +30618,7 @@
         </w:trPr>
         <w:tc>
           <w:tcPr>
-            <w:tcW w:type="dxa" w:w="2992"/>
+            <w:tcW w:type="dxa" w:w="2494"/>
             <w:vAlign w:val="center"/>
             <w:shd w:fill="EEF4F8"/>
           </w:tcPr>
@@ -29375,7 +30637,7 @@
         </w:tc>
         <w:tc>
           <w:tcPr>
-            <w:tcW w:type="dxa" w:w="2992"/>
+            <w:tcW w:type="dxa" w:w="2494"/>
             <w:vAlign w:val="center"/>
             <w:shd w:fill="EEF4F8"/>
           </w:tcPr>
@@ -29394,7 +30656,26 @@
         </w:tc>
         <w:tc>
           <w:tcPr>
-            <w:tcW w:type="dxa" w:w="2992"/>
+            <w:tcW w:type="dxa" w:w="2494"/>
+            <w:vAlign w:val="center"/>
+            <w:shd w:fill="EEF4F8"/>
+          </w:tcPr>
+          <w:p>
+            <w:pPr>
+              <w:spacing w:after="0"/>
+            </w:pPr>
+            <w:r>
+              <w:rPr>
+                <w:rFonts w:ascii="Aptos" w:hAnsi="Aptos"/>
+                <w:sz w:val="16"/>
+              </w:rPr>
+              <w:t>OPENVINO-SECTOR-EXPERIENCE-QUALITY-v3</w:t>
+            </w:r>
+          </w:p>
+        </w:tc>
+        <w:tc>
+          <w:tcPr>
+            <w:tcW w:type="dxa" w:w="2494"/>
             <w:vAlign w:val="center"/>
             <w:shd w:fill="EEF4F8"/>
           </w:tcPr>
@@ -29413,7 +30694,7 @@
         </w:tc>
         <w:tc>
           <w:tcPr>
-            <w:tcW w:type="dxa" w:w="2992"/>
+            <w:tcW w:type="dxa" w:w="2494"/>
             <w:vAlign w:val="center"/>
             <w:shd w:fill="EEF4F8"/>
           </w:tcPr>
@@ -29432,7 +30713,7 @@
         </w:tc>
         <w:tc>
           <w:tcPr>
-            <w:tcW w:type="dxa" w:w="2992"/>
+            <w:tcW w:type="dxa" w:w="2494"/>
             <w:vAlign w:val="center"/>
             <w:shd w:fill="EEF4F8"/>
           </w:tcPr>
@@ -29456,7 +30737,7 @@
         </w:trPr>
         <w:tc>
           <w:tcPr>
-            <w:tcW w:type="dxa" w:w="2992"/>
+            <w:tcW w:type="dxa" w:w="2494"/>
             <w:vAlign w:val="center"/>
           </w:tcPr>
           <w:p>
@@ -29474,7 +30755,7 @@
         </w:tc>
         <w:tc>
           <w:tcPr>
-            <w:tcW w:type="dxa" w:w="2992"/>
+            <w:tcW w:type="dxa" w:w="2494"/>
             <w:vAlign w:val="center"/>
           </w:tcPr>
           <w:p>
@@ -29492,7 +30773,25 @@
         </w:tc>
         <w:tc>
           <w:tcPr>
-            <w:tcW w:type="dxa" w:w="2992"/>
+            <w:tcW w:type="dxa" w:w="2494"/>
+            <w:vAlign w:val="center"/>
+          </w:tcPr>
+          <w:p>
+            <w:pPr>
+              <w:spacing w:after="0"/>
+            </w:pPr>
+            <w:r>
+              <w:rPr>
+                <w:rFonts w:ascii="Aptos" w:hAnsi="Aptos"/>
+                <w:sz w:val="16"/>
+              </w:rPr>
+              <w:t>GTQ-PROMPTS-v1</w:t>
+            </w:r>
+          </w:p>
+        </w:tc>
+        <w:tc>
+          <w:tcPr>
+            <w:tcW w:type="dxa" w:w="2494"/>
             <w:vAlign w:val="center"/>
           </w:tcPr>
           <w:p>
@@ -29510,7 +30809,7 @@
         </w:tc>
         <w:tc>
           <w:tcPr>
-            <w:tcW w:type="dxa" w:w="2992"/>
+            <w:tcW w:type="dxa" w:w="2494"/>
             <w:vAlign w:val="center"/>
           </w:tcPr>
           <w:p>
@@ -29528,7 +30827,7 @@
         </w:tc>
         <w:tc>
           <w:tcPr>
-            <w:tcW w:type="dxa" w:w="2992"/>
+            <w:tcW w:type="dxa" w:w="2494"/>
             <w:vAlign w:val="center"/>
           </w:tcPr>
           <w:p>

</xml_diff>